<commit_message>
Revise M&M and Results/Discussion; remove old draft duplicates
- Materials & Methods: rename batches to 1/2, complete formulation and
  analytical tables, fill in bread-preparation protocol, resolve verify notes
- Results & Discussion: trim repeated conclusions across the paradox,
  integrated discussion, next-steps, 9.3 and final-discussion sections;
  copy-edit Section 10

Co-Authored-By: Claude Opus 4.8 <noreply@anthropic.com>
</commit_message>
<xml_diff>
--- a/02_Proposal/Materials_and_Methods_ThesisSection.docx
+++ b/02_Proposal/Materials_and_Methods_ThesisSection.docx
@@ -53,7 +53,45 @@
         <w:rPr>
           <w:color w:val="000000"/>
         </w:rPr>
-        <w:t>This chapter describes the materials, formulations and analytical procedures used to evaluate how xylanase enzymatic treatment and particle-size fractionation influence the techno-functional and sensory behaviour of brewer's spent grain (BSG) incorporated into wheat-based bread. The experimental work was organised in two successive batches. Batch A (Phase 1) established the baseline effect of BSG substitution (10% and 20%) and of xylanase added at 70 ppm to unsieved BSG. Batch B (Phase 2) widened the formulation space to test two of the mitigation strategies identified in Phase 1: replacement of unsieved BSG by a fine fraction obtained by sieving (≤250 µm) and an increase of the xylanase dose to 140 ppm. The same baking, fermentation and analytical protocols were applied across both batches so that the results could be compared directly.</w:t>
+        <w:t xml:space="preserve">This chapter describes the materials, formulations and analytical procedures used to evaluate how xylanase enzymatic treatment and particle-size fractionation influence the techno-functional and sensory behaviour of brewer's spent grain (BSG) incorporated into wheat-based bread. The experimental work was organised in two successive batches. </w:t>
+      </w:r>
+      <w:r>
+        <w:rPr>
+          <w:color w:val="000000"/>
+        </w:rPr>
+        <w:t>Batch 1</w:t>
+      </w:r>
+      <w:r>
+        <w:rPr>
+          <w:color w:val="000000"/>
+        </w:rPr>
+        <w:t xml:space="preserve"> (Phase 1) established the baseline effect of BSG substitution (10% and 20%) and of xylanase added at 70 ppm to unsieved BSG. </w:t>
+      </w:r>
+      <w:r>
+        <w:rPr>
+          <w:color w:val="000000"/>
+        </w:rPr>
+        <w:t>Batch 2</w:t>
+      </w:r>
+      <w:r>
+        <w:rPr>
+          <w:color w:val="000000"/>
+        </w:rPr>
+        <w:t xml:space="preserve"> (Phase 2) widened the formulation space to test two of the mitigation strategies identified in Phase 1: replacement of unsieved BSG by a fine fraction obtained by sieving (≤250 µm) and an increase of the xylanase dose to 140 ppm. The same baking, fermentation and analytical protocols were applied across both batches so that the results could be compared directly.</w:t>
+      </w:r>
+    </w:p>
+    <w:p>
+      <w:pPr>
+        <w:jc w:val="both"/>
+        <w:rPr>
+          <w:color w:val="000000"/>
+        </w:rPr>
+      </w:pPr>
+      <w:r>
+        <w:rPr>
+          <w:color w:val="000000"/>
+        </w:rPr>
+        <w:t>Photographs of the materials, experimental procedures, and the final product obtained are provided in the Appendix.</w:t>
       </w:r>
     </w:p>
     <w:p>
@@ -107,7 +145,88 @@
         <w:rPr>
           <w:color w:val="000000"/>
         </w:rPr>
-        <w:t>Brewer's spent grain was obtained from the micro-malthouse of the AgroBioTech Research Centre, Nitra (Slovakia). The barley malt used for mashing was malting barley supplied by HEINEKEN Slovakia, Hurbanovo [to confirm: collection/processing date]. Immediately after collection the wet BSG was refrigerated at 4 °C and subsequently dried in a forced-air drying oven at 60 °C for 8 h until a stable, storage-suitable moisture content was reached. The dried material was milled to a uniform particle size [to confirm: mill type and target particle size before sieving] and stored in sealed polyethylene bags at ambient temperature until use.</w:t>
+        <w:t xml:space="preserve">Brewer's spent grain was obtained from the micro-malthouse of the AgroBioTech Research Centre, Nitra (Slovakia). The barley malt used for mashing was malting barley supplied by HEINEKEN Slovakia, Hurbanovo </w:t>
+      </w:r>
+      <w:commentRangeStart w:id="0"/>
+      <w:r>
+        <w:rPr>
+          <w:color w:val="000000"/>
+        </w:rPr>
+        <w:t>[to confirm: collection/processing date]</w:t>
+      </w:r>
+      <w:commentRangeEnd w:id="0"/>
+      <w:r>
+        <w:rPr>
+          <w:rStyle w:val="CommentReference"/>
+          <w:color w:val="000000"/>
+          <w:sz w:val="24"/>
+          <w:szCs w:val="24"/>
+        </w:rPr>
+        <w:commentReference w:id="0"/>
+      </w:r>
+      <w:r>
+        <w:rPr>
+          <w:color w:val="000000"/>
+        </w:rPr>
+        <w:t xml:space="preserve">. </w:t>
+      </w:r>
+      <w:commentRangeStart w:id="1"/>
+      <w:r>
+        <w:rPr>
+          <w:color w:val="000000"/>
+        </w:rPr>
+        <w:t xml:space="preserve">Immediately after collection the wet BSG was refrigerated at 4 °C and subsequently dried in a forced-air drying oven at 60 °C for 8 h until a stable, storage-suitable moisture content was reached. </w:t>
+      </w:r>
+      <w:commentRangeEnd w:id="1"/>
+      <w:r>
+        <w:rPr>
+          <w:rStyle w:val="CommentReference"/>
+          <w:color w:val="000000"/>
+          <w:sz w:val="24"/>
+          <w:szCs w:val="24"/>
+        </w:rPr>
+        <w:commentReference w:id="1"/>
+      </w:r>
+      <w:r>
+        <w:rPr>
+          <w:color w:val="000000"/>
+        </w:rPr>
+        <w:t xml:space="preserve">The dried material was milled to a uniform particle size </w:t>
+      </w:r>
+      <w:commentRangeStart w:id="2"/>
+      <w:r>
+        <w:rPr>
+          <w:color w:val="000000"/>
+        </w:rPr>
+        <w:t>[to confirm: mill type and target particle size before sieving]</w:t>
+      </w:r>
+      <w:commentRangeEnd w:id="2"/>
+      <w:r>
+        <w:rPr>
+          <w:rStyle w:val="CommentReference"/>
+          <w:color w:val="000000"/>
+          <w:sz w:val="24"/>
+          <w:szCs w:val="24"/>
+        </w:rPr>
+        <w:commentReference w:id="2"/>
+      </w:r>
+      <w:r>
+        <w:rPr>
+          <w:color w:val="000000"/>
+        </w:rPr>
+        <w:t xml:space="preserve"> and stored in sealed polyethylene </w:t>
+      </w:r>
+      <w:r>
+        <w:rPr>
+          <w:color w:val="000000"/>
+        </w:rPr>
+        <w:t>jars</w:t>
+      </w:r>
+      <w:r>
+        <w:rPr>
+          <w:color w:val="000000"/>
+        </w:rPr>
+        <w:t xml:space="preserve"> at ambient temperature until use.</w:t>
       </w:r>
     </w:p>
     <w:p>
@@ -121,7 +240,36 @@
         <w:rPr>
           <w:color w:val="000000"/>
         </w:rPr>
-        <w:t>For Batch B, a portion of the dried, milled BSG was sieved through a 250 µm mesh and the fraction passing through the sieve (hereafter "BSG fraction", ≤250 µm) was retained. This fine fraction is enriched in arabinoxylan and protein and depleted in the cellulose- and lignin-rich coarse husk and pericarp, which concentrate in the &gt;250 µm fraction discarded during sieving (Robertson et al., 2010; Lynch et al., 2016).</w:t>
+        <w:t xml:space="preserve">For </w:t>
+      </w:r>
+      <w:r>
+        <w:rPr>
+          <w:color w:val="000000"/>
+        </w:rPr>
+        <w:t>Batch 2</w:t>
+      </w:r>
+      <w:r>
+        <w:rPr>
+          <w:color w:val="000000"/>
+        </w:rPr>
+        <w:t xml:space="preserve">, a portion of the dried, milled BSG was sieved through a 250 µm mesh and the fraction passing through the sieve (hereafter "BSG fraction", ≤250 µm) was retained. This fine fraction is enriched in arabinoxylan and protein and depleted in the cellulose- and lignin-rich coarse husk and pericarp, which concentrate in the &gt;250 µm fraction discarded during sieving </w:t>
+      </w:r>
+      <w:commentRangeStart w:id="3"/>
+      <w:r>
+        <w:rPr>
+          <w:color w:val="000000"/>
+        </w:rPr>
+        <w:t>(Robertson et al., 2010; Lynch et al., 2016).</w:t>
+      </w:r>
+      <w:commentRangeEnd w:id="3"/>
+      <w:r>
+        <w:rPr>
+          <w:rStyle w:val="CommentReference"/>
+          <w:color w:val="000000"/>
+          <w:sz w:val="24"/>
+          <w:szCs w:val="24"/>
+        </w:rPr>
+        <w:commentReference w:id="3"/>
       </w:r>
     </w:p>
     <w:p>
@@ -189,7 +337,62 @@
         <w:rPr>
           <w:color w:val="000000"/>
         </w:rPr>
-        <w:t>The enzyme used was Pentopan Mono BG (Novozymes), a commercial endo-1,4-β-xylanase preparation derived from Aspergillus oryzae and belonging to glycoside hydrolase family GH11. In contrast with a separate buffered hydrolysis step, the enzyme was applied by direct addition: the xylanase powder was incorporated directly into the flour on a flour-mass basis at the target dosage (70 ppm in Batch A; 70 and 140 ppm in Batch B) and homogenised with the dry ingredients before dough mixing.</w:t>
+        <w:t>The enzyme used was Pentopan Mono BG (Novozymes), a commercial endo-1,4-β-xylanase preparation derived from Aspergillus oryzae and belonging to glycoside hydrolase family GH11.</w:t>
+      </w:r>
+      <w:r>
+        <w:rPr>
+          <w:color w:val="000000"/>
+        </w:rPr>
+        <w:t>T</w:t>
+      </w:r>
+      <w:r>
+        <w:rPr>
+          <w:color w:val="000000"/>
+        </w:rPr>
+        <w:t xml:space="preserve">he enzyme was applied by direct addition: the xylanase powder was incorporated directly into the flour on a flour-mass basis at the target dosage (70 ppm </w:t>
+      </w:r>
+      <w:r>
+        <w:rPr>
+          <w:color w:val="000000"/>
+        </w:rPr>
+        <w:lastRenderedPageBreak/>
+        <w:t xml:space="preserve">in </w:t>
+      </w:r>
+      <w:r>
+        <w:rPr>
+          <w:color w:val="000000"/>
+        </w:rPr>
+        <w:t>Batch 1</w:t>
+      </w:r>
+      <w:r>
+        <w:rPr>
+          <w:color w:val="000000"/>
+        </w:rPr>
+        <w:t xml:space="preserve">; 70 and 140 ppm in </w:t>
+      </w:r>
+      <w:r>
+        <w:rPr>
+          <w:color w:val="000000"/>
+        </w:rPr>
+        <w:t>Batch 2</w:t>
+      </w:r>
+      <w:r>
+        <w:rPr>
+          <w:color w:val="000000"/>
+        </w:rPr>
+        <w:t xml:space="preserve">) and </w:t>
+      </w:r>
+      <w:r>
+        <w:rPr>
+          <w:color w:val="000000"/>
+        </w:rPr>
+        <w:t>homogenized</w:t>
+      </w:r>
+      <w:r>
+        <w:rPr>
+          <w:color w:val="000000"/>
+        </w:rPr>
+        <w:t xml:space="preserve"> with the dry ingredients before dough mixing.</w:t>
       </w:r>
     </w:p>
     <w:p>
@@ -209,7 +412,6 @@
           <w:color w:val="000000"/>
           <w:sz w:val="26"/>
         </w:rPr>
-        <w:lastRenderedPageBreak/>
         <w:t>3.2.4 Other ingredients and reagents</w:t>
       </w:r>
     </w:p>
@@ -264,7 +466,25 @@
           <w:color w:val="000000"/>
           <w:sz w:val="26"/>
         </w:rPr>
-        <w:t>3.3.1 Batch A (Phase 1)</w:t>
+        <w:t xml:space="preserve">3.3.1 </w:t>
+      </w:r>
+      <w:r>
+        <w:rPr>
+          <w:rFonts w:cs="Times New Roman"/>
+          <w:b/>
+          <w:color w:val="000000"/>
+          <w:sz w:val="26"/>
+        </w:rPr>
+        <w:t>Batch 1</w:t>
+      </w:r>
+      <w:r>
+        <w:rPr>
+          <w:rFonts w:cs="Times New Roman"/>
+          <w:b/>
+          <w:color w:val="000000"/>
+          <w:sz w:val="26"/>
+        </w:rPr>
+        <w:t xml:space="preserve"> (Phase 1)</w:t>
       </w:r>
     </w:p>
     <w:p>
@@ -278,7 +498,54 @@
         <w:rPr>
           <w:color w:val="000000"/>
         </w:rPr>
-        <w:t>Five formulations were produced: a wheat-flour control (0% BSG), 10% and 20% BSG (unsieved), and 10% and 20% BSG treated with xylanase at 70 ppm on a flour basis (10% BSG+E and 20% BSG+E). BSG was incorporated as a partial replacement of wheat flour at the stated substitution levels. Water was added according to the farinograph water absorption of each blend (Section 3.5.3). The Batch A formulations are summarised in Table 1.</w:t>
+        <w:t>Five formulations were produced: a wheat-flour control (0% BSG), 10% and 20% BSG (unsieved), and 10% and 20% BSG treated with xylanase at 70 ppm on a flour basis (10% BSG+E and 20% BSG+E). BSG was incorporated as a partial replacement of wheat flour at the stated substitution levels. Water was added according to the farinograph water absorption of each blend (</w:t>
+      </w:r>
+      <w:commentRangeStart w:id="4"/>
+      <w:r>
+        <w:rPr>
+          <w:color w:val="000000"/>
+        </w:rPr>
+        <w:t>Section 3.5.3</w:t>
+      </w:r>
+      <w:commentRangeEnd w:id="4"/>
+      <w:r>
+        <w:rPr>
+          <w:rStyle w:val="CommentReference"/>
+          <w:color w:val="000000"/>
+          <w:sz w:val="24"/>
+          <w:szCs w:val="24"/>
+        </w:rPr>
+        <w:commentReference w:id="4"/>
+      </w:r>
+      <w:r>
+        <w:rPr>
+          <w:color w:val="000000"/>
+        </w:rPr>
+        <w:t xml:space="preserve">). The </w:t>
+      </w:r>
+      <w:r>
+        <w:rPr>
+          <w:color w:val="000000"/>
+        </w:rPr>
+        <w:t>Batch 1</w:t>
+      </w:r>
+      <w:r>
+        <w:rPr>
+          <w:color w:val="000000"/>
+        </w:rPr>
+        <w:t xml:space="preserve"> formulations are </w:t>
+      </w:r>
+      <w:r>
+        <w:rPr>
+          <w:color w:val="000000"/>
+        </w:rPr>
+        <w:t>summarized</w:t>
+      </w:r>
+      <w:r>
+        <w:rPr>
+          <w:color w:val="000000"/>
+        </w:rPr>
+        <w:t xml:space="preserve"> in Table 1.</w:t>
       </w:r>
     </w:p>
     <w:p>
@@ -297,7 +564,25 @@
           <w:color w:val="000000"/>
           <w:sz w:val="22"/>
         </w:rPr>
-        <w:t>Table 1. Batch A (Phase 1) bread formulations.</w:t>
+        <w:t xml:space="preserve">Table 1. </w:t>
+      </w:r>
+      <w:r>
+        <w:rPr>
+          <w:b/>
+          <w:i/>
+          <w:color w:val="000000"/>
+          <w:sz w:val="22"/>
+        </w:rPr>
+        <w:t>Batch 1</w:t>
+      </w:r>
+      <w:r>
+        <w:rPr>
+          <w:b/>
+          <w:i/>
+          <w:color w:val="000000"/>
+          <w:sz w:val="22"/>
+        </w:rPr>
+        <w:t xml:space="preserve"> (Phase 1) bread formulations.</w:t>
       </w:r>
     </w:p>
     <w:tbl>
@@ -307,15 +592,39 @@
         <w:tblLook w:val="04A0" w:firstRow="1" w:lastRow="0" w:firstColumn="1" w:lastColumn="0" w:noHBand="0" w:noVBand="1"/>
       </w:tblPr>
       <w:tblGrid>
-        <w:gridCol w:w="2123"/>
-        <w:gridCol w:w="2123"/>
-        <w:gridCol w:w="2124"/>
-        <w:gridCol w:w="2124"/>
+        <w:gridCol w:w="421"/>
+        <w:gridCol w:w="1417"/>
+        <w:gridCol w:w="2412"/>
+        <w:gridCol w:w="1417"/>
+        <w:gridCol w:w="1415"/>
+        <w:gridCol w:w="1412"/>
       </w:tblGrid>
       <w:tr>
         <w:tc>
           <w:tcPr>
-            <w:tcW w:w="1250" w:type="pct"/>
+            <w:tcW w:w="248" w:type="pct"/>
+          </w:tcPr>
+          <w:p>
+            <w:pPr>
+              <w:rPr>
+                <w:b/>
+                <w:color w:val="000000"/>
+                <w:sz w:val="20"/>
+              </w:rPr>
+            </w:pPr>
+            <w:r>
+              <w:rPr>
+                <w:b/>
+                <w:color w:val="000000"/>
+                <w:sz w:val="20"/>
+              </w:rPr>
+              <w:t>N</w:t>
+            </w:r>
+          </w:p>
+        </w:tc>
+        <w:tc>
+          <w:tcPr>
+            <w:tcW w:w="834" w:type="pct"/>
           </w:tcPr>
           <w:p>
             <w:pPr>
@@ -337,7 +646,7 @@
         </w:tc>
         <w:tc>
           <w:tcPr>
-            <w:tcW w:w="1250" w:type="pct"/>
+            <w:tcW w:w="1420" w:type="pct"/>
           </w:tcPr>
           <w:p>
             <w:pPr>
@@ -359,7 +668,7 @@
         </w:tc>
         <w:tc>
           <w:tcPr>
-            <w:tcW w:w="1250" w:type="pct"/>
+            <w:tcW w:w="834" w:type="pct"/>
           </w:tcPr>
           <w:p>
             <w:pPr>
@@ -381,7 +690,7 @@
         </w:tc>
         <w:tc>
           <w:tcPr>
-            <w:tcW w:w="1250" w:type="pct"/>
+            <w:tcW w:w="833" w:type="pct"/>
           </w:tcPr>
           <w:p>
             <w:pPr>
@@ -398,6 +707,28 @@
                 <w:sz w:val="20"/>
               </w:rPr>
               <w:t>Xylanase (ppm)</w:t>
+            </w:r>
+          </w:p>
+        </w:tc>
+        <w:tc>
+          <w:tcPr>
+            <w:tcW w:w="831" w:type="pct"/>
+          </w:tcPr>
+          <w:p>
+            <w:pPr>
+              <w:rPr>
+                <w:b/>
+                <w:color w:val="000000"/>
+                <w:sz w:val="20"/>
+              </w:rPr>
+            </w:pPr>
+            <w:r>
+              <w:rPr>
+                <w:b/>
+                <w:color w:val="000000"/>
+                <w:sz w:val="20"/>
+              </w:rPr>
+              <w:t>Water (mL)</w:t>
             </w:r>
           </w:p>
         </w:tc>
@@ -405,7 +736,29 @@
       <w:tr>
         <w:tc>
           <w:tcPr>
-            <w:tcW w:w="1250" w:type="pct"/>
+            <w:tcW w:w="248" w:type="pct"/>
+          </w:tcPr>
+          <w:p>
+            <w:pPr>
+              <w:rPr>
+                <w:b/>
+                <w:color w:val="000000"/>
+                <w:sz w:val="20"/>
+              </w:rPr>
+            </w:pPr>
+            <w:r>
+              <w:rPr>
+                <w:b/>
+                <w:color w:val="000000"/>
+                <w:sz w:val="20"/>
+              </w:rPr>
+              <w:t>1</w:t>
+            </w:r>
+          </w:p>
+        </w:tc>
+        <w:tc>
+          <w:tcPr>
+            <w:tcW w:w="834" w:type="pct"/>
           </w:tcPr>
           <w:p>
             <w:pPr>
@@ -427,7 +780,7 @@
         </w:tc>
         <w:tc>
           <w:tcPr>
-            <w:tcW w:w="1250" w:type="pct"/>
+            <w:tcW w:w="1420" w:type="pct"/>
           </w:tcPr>
           <w:p>
             <w:pPr>
@@ -449,7 +802,7 @@
         </w:tc>
         <w:tc>
           <w:tcPr>
-            <w:tcW w:w="1250" w:type="pct"/>
+            <w:tcW w:w="834" w:type="pct"/>
           </w:tcPr>
           <w:p>
             <w:pPr>
@@ -471,7 +824,7 @@
         </w:tc>
         <w:tc>
           <w:tcPr>
-            <w:tcW w:w="1250" w:type="pct"/>
+            <w:tcW w:w="833" w:type="pct"/>
           </w:tcPr>
           <w:p>
             <w:pPr>
@@ -488,6 +841,28 @@
                 <w:sz w:val="20"/>
               </w:rPr>
               <w:t>0</w:t>
+            </w:r>
+          </w:p>
+        </w:tc>
+        <w:tc>
+          <w:tcPr>
+            <w:tcW w:w="831" w:type="pct"/>
+          </w:tcPr>
+          <w:p>
+            <w:pPr>
+              <w:rPr>
+                <w:b/>
+                <w:color w:val="000000"/>
+                <w:sz w:val="20"/>
+              </w:rPr>
+            </w:pPr>
+            <w:r>
+              <w:rPr>
+                <w:b/>
+                <w:color w:val="000000"/>
+                <w:sz w:val="20"/>
+              </w:rPr>
+              <w:t>162</w:t>
             </w:r>
           </w:p>
         </w:tc>
@@ -495,7 +870,29 @@
       <w:tr>
         <w:tc>
           <w:tcPr>
-            <w:tcW w:w="1250" w:type="pct"/>
+            <w:tcW w:w="248" w:type="pct"/>
+          </w:tcPr>
+          <w:p>
+            <w:pPr>
+              <w:rPr>
+                <w:b/>
+                <w:color w:val="000000"/>
+                <w:sz w:val="20"/>
+              </w:rPr>
+            </w:pPr>
+            <w:r>
+              <w:rPr>
+                <w:b/>
+                <w:color w:val="000000"/>
+                <w:sz w:val="20"/>
+              </w:rPr>
+              <w:t>2</w:t>
+            </w:r>
+          </w:p>
+        </w:tc>
+        <w:tc>
+          <w:tcPr>
+            <w:tcW w:w="834" w:type="pct"/>
           </w:tcPr>
           <w:p>
             <w:pPr>
@@ -517,7 +914,7 @@
         </w:tc>
         <w:tc>
           <w:tcPr>
-            <w:tcW w:w="1250" w:type="pct"/>
+            <w:tcW w:w="1420" w:type="pct"/>
           </w:tcPr>
           <w:p>
             <w:pPr>
@@ -539,7 +936,7 @@
         </w:tc>
         <w:tc>
           <w:tcPr>
-            <w:tcW w:w="1250" w:type="pct"/>
+            <w:tcW w:w="834" w:type="pct"/>
           </w:tcPr>
           <w:p>
             <w:pPr>
@@ -561,7 +958,7 @@
         </w:tc>
         <w:tc>
           <w:tcPr>
-            <w:tcW w:w="1250" w:type="pct"/>
+            <w:tcW w:w="833" w:type="pct"/>
           </w:tcPr>
           <w:p>
             <w:pPr>
@@ -578,6 +975,28 @@
                 <w:sz w:val="20"/>
               </w:rPr>
               <w:t>0</w:t>
+            </w:r>
+          </w:p>
+        </w:tc>
+        <w:tc>
+          <w:tcPr>
+            <w:tcW w:w="831" w:type="pct"/>
+          </w:tcPr>
+          <w:p>
+            <w:pPr>
+              <w:rPr>
+                <w:b/>
+                <w:color w:val="000000"/>
+                <w:sz w:val="20"/>
+              </w:rPr>
+            </w:pPr>
+            <w:r>
+              <w:rPr>
+                <w:b/>
+                <w:color w:val="000000"/>
+                <w:sz w:val="20"/>
+              </w:rPr>
+              <w:t>165</w:t>
             </w:r>
           </w:p>
         </w:tc>
@@ -585,7 +1004,29 @@
       <w:tr>
         <w:tc>
           <w:tcPr>
-            <w:tcW w:w="1250" w:type="pct"/>
+            <w:tcW w:w="248" w:type="pct"/>
+          </w:tcPr>
+          <w:p>
+            <w:pPr>
+              <w:rPr>
+                <w:b/>
+                <w:color w:val="000000"/>
+                <w:sz w:val="20"/>
+              </w:rPr>
+            </w:pPr>
+            <w:r>
+              <w:rPr>
+                <w:b/>
+                <w:color w:val="000000"/>
+                <w:sz w:val="20"/>
+              </w:rPr>
+              <w:t>3</w:t>
+            </w:r>
+          </w:p>
+        </w:tc>
+        <w:tc>
+          <w:tcPr>
+            <w:tcW w:w="834" w:type="pct"/>
           </w:tcPr>
           <w:p>
             <w:pPr>
@@ -607,7 +1048,7 @@
         </w:tc>
         <w:tc>
           <w:tcPr>
-            <w:tcW w:w="1250" w:type="pct"/>
+            <w:tcW w:w="1420" w:type="pct"/>
           </w:tcPr>
           <w:p>
             <w:pPr>
@@ -629,7 +1070,7 @@
         </w:tc>
         <w:tc>
           <w:tcPr>
-            <w:tcW w:w="1250" w:type="pct"/>
+            <w:tcW w:w="834" w:type="pct"/>
           </w:tcPr>
           <w:p>
             <w:pPr>
@@ -651,7 +1092,7 @@
         </w:tc>
         <w:tc>
           <w:tcPr>
-            <w:tcW w:w="1250" w:type="pct"/>
+            <w:tcW w:w="833" w:type="pct"/>
           </w:tcPr>
           <w:p>
             <w:pPr>
@@ -668,6 +1109,28 @@
                 <w:sz w:val="20"/>
               </w:rPr>
               <w:t>0</w:t>
+            </w:r>
+          </w:p>
+        </w:tc>
+        <w:tc>
+          <w:tcPr>
+            <w:tcW w:w="831" w:type="pct"/>
+          </w:tcPr>
+          <w:p>
+            <w:pPr>
+              <w:rPr>
+                <w:b/>
+                <w:color w:val="000000"/>
+                <w:sz w:val="20"/>
+              </w:rPr>
+            </w:pPr>
+            <w:r>
+              <w:rPr>
+                <w:b/>
+                <w:color w:val="000000"/>
+                <w:sz w:val="20"/>
+              </w:rPr>
+              <w:t>180</w:t>
             </w:r>
           </w:p>
         </w:tc>
@@ -675,7 +1138,29 @@
       <w:tr>
         <w:tc>
           <w:tcPr>
-            <w:tcW w:w="1250" w:type="pct"/>
+            <w:tcW w:w="248" w:type="pct"/>
+          </w:tcPr>
+          <w:p>
+            <w:pPr>
+              <w:rPr>
+                <w:b/>
+                <w:color w:val="000000"/>
+                <w:sz w:val="20"/>
+              </w:rPr>
+            </w:pPr>
+            <w:r>
+              <w:rPr>
+                <w:b/>
+                <w:color w:val="000000"/>
+                <w:sz w:val="20"/>
+              </w:rPr>
+              <w:t>4</w:t>
+            </w:r>
+          </w:p>
+        </w:tc>
+        <w:tc>
+          <w:tcPr>
+            <w:tcW w:w="834" w:type="pct"/>
           </w:tcPr>
           <w:p>
             <w:pPr>
@@ -697,7 +1182,7 @@
         </w:tc>
         <w:tc>
           <w:tcPr>
-            <w:tcW w:w="1250" w:type="pct"/>
+            <w:tcW w:w="1420" w:type="pct"/>
           </w:tcPr>
           <w:p>
             <w:pPr>
@@ -719,7 +1204,7 @@
         </w:tc>
         <w:tc>
           <w:tcPr>
-            <w:tcW w:w="1250" w:type="pct"/>
+            <w:tcW w:w="834" w:type="pct"/>
           </w:tcPr>
           <w:p>
             <w:pPr>
@@ -741,7 +1226,7 @@
         </w:tc>
         <w:tc>
           <w:tcPr>
-            <w:tcW w:w="1250" w:type="pct"/>
+            <w:tcW w:w="833" w:type="pct"/>
           </w:tcPr>
           <w:p>
             <w:pPr>
@@ -758,6 +1243,28 @@
                 <w:sz w:val="20"/>
               </w:rPr>
               <w:t>70</w:t>
+            </w:r>
+          </w:p>
+        </w:tc>
+        <w:tc>
+          <w:tcPr>
+            <w:tcW w:w="831" w:type="pct"/>
+          </w:tcPr>
+          <w:p>
+            <w:pPr>
+              <w:rPr>
+                <w:b/>
+                <w:color w:val="000000"/>
+                <w:sz w:val="20"/>
+              </w:rPr>
+            </w:pPr>
+            <w:r>
+              <w:rPr>
+                <w:b/>
+                <w:color w:val="000000"/>
+                <w:sz w:val="20"/>
+              </w:rPr>
+              <w:t>175</w:t>
             </w:r>
           </w:p>
         </w:tc>
@@ -765,7 +1272,29 @@
       <w:tr>
         <w:tc>
           <w:tcPr>
-            <w:tcW w:w="1250" w:type="pct"/>
+            <w:tcW w:w="248" w:type="pct"/>
+          </w:tcPr>
+          <w:p>
+            <w:pPr>
+              <w:rPr>
+                <w:b/>
+                <w:color w:val="000000"/>
+                <w:sz w:val="20"/>
+              </w:rPr>
+            </w:pPr>
+            <w:r>
+              <w:rPr>
+                <w:b/>
+                <w:color w:val="000000"/>
+                <w:sz w:val="20"/>
+              </w:rPr>
+              <w:t>5</w:t>
+            </w:r>
+          </w:p>
+        </w:tc>
+        <w:tc>
+          <w:tcPr>
+            <w:tcW w:w="834" w:type="pct"/>
           </w:tcPr>
           <w:p>
             <w:pPr>
@@ -787,7 +1316,7 @@
         </w:tc>
         <w:tc>
           <w:tcPr>
-            <w:tcW w:w="1250" w:type="pct"/>
+            <w:tcW w:w="1420" w:type="pct"/>
           </w:tcPr>
           <w:p>
             <w:pPr>
@@ -809,7 +1338,7 @@
         </w:tc>
         <w:tc>
           <w:tcPr>
-            <w:tcW w:w="1250" w:type="pct"/>
+            <w:tcW w:w="834" w:type="pct"/>
           </w:tcPr>
           <w:p>
             <w:pPr>
@@ -831,7 +1360,7 @@
         </w:tc>
         <w:tc>
           <w:tcPr>
-            <w:tcW w:w="1250" w:type="pct"/>
+            <w:tcW w:w="833" w:type="pct"/>
           </w:tcPr>
           <w:p>
             <w:pPr>
@@ -848,6 +1377,28 @@
                 <w:sz w:val="20"/>
               </w:rPr>
               <w:t>70</w:t>
+            </w:r>
+          </w:p>
+        </w:tc>
+        <w:tc>
+          <w:tcPr>
+            <w:tcW w:w="831" w:type="pct"/>
+          </w:tcPr>
+          <w:p>
+            <w:pPr>
+              <w:rPr>
+                <w:b/>
+                <w:color w:val="000000"/>
+                <w:sz w:val="20"/>
+              </w:rPr>
+            </w:pPr>
+            <w:r>
+              <w:rPr>
+                <w:b/>
+                <w:color w:val="000000"/>
+                <w:sz w:val="20"/>
+              </w:rPr>
+              <w:t>190</w:t>
             </w:r>
           </w:p>
         </w:tc>
@@ -879,7 +1430,25 @@
           <w:color w:val="000000"/>
           <w:sz w:val="26"/>
         </w:rPr>
-        <w:t>3.3.2 Batch B (Phase 2)</w:t>
+        <w:t xml:space="preserve">3.3.2 </w:t>
+      </w:r>
+      <w:r>
+        <w:rPr>
+          <w:rFonts w:cs="Times New Roman"/>
+          <w:b/>
+          <w:color w:val="000000"/>
+          <w:sz w:val="26"/>
+        </w:rPr>
+        <w:t>Batch 2</w:t>
+      </w:r>
+      <w:r>
+        <w:rPr>
+          <w:rFonts w:cs="Times New Roman"/>
+          <w:b/>
+          <w:color w:val="000000"/>
+          <w:sz w:val="26"/>
+        </w:rPr>
+        <w:t xml:space="preserve"> (Phase 2)</w:t>
       </w:r>
     </w:p>
     <w:p>
@@ -912,7 +1481,25 @@
           <w:color w:val="000000"/>
           <w:sz w:val="22"/>
         </w:rPr>
-        <w:t>Table 2. Batch B (Phase 2) bread formulations (250 g flour basis).</w:t>
+        <w:t xml:space="preserve">Table 2. </w:t>
+      </w:r>
+      <w:r>
+        <w:rPr>
+          <w:b/>
+          <w:i/>
+          <w:color w:val="000000"/>
+          <w:sz w:val="22"/>
+        </w:rPr>
+        <w:t>Batch 2</w:t>
+      </w:r>
+      <w:r>
+        <w:rPr>
+          <w:b/>
+          <w:i/>
+          <w:color w:val="000000"/>
+          <w:sz w:val="22"/>
+        </w:rPr>
+        <w:t xml:space="preserve"> (Phase 2) bread formulations (250 g flour basis).</w:t>
       </w:r>
     </w:p>
     <w:tbl>
@@ -922,16 +1509,39 @@
         <w:tblLook w:val="04A0" w:firstRow="1" w:lastRow="0" w:firstColumn="1" w:lastColumn="0" w:noHBand="0" w:noVBand="1"/>
       </w:tblPr>
       <w:tblGrid>
-        <w:gridCol w:w="1698"/>
-        <w:gridCol w:w="1699"/>
-        <w:gridCol w:w="1699"/>
-        <w:gridCol w:w="1699"/>
-        <w:gridCol w:w="1699"/>
+        <w:gridCol w:w="422"/>
+        <w:gridCol w:w="2976"/>
+        <w:gridCol w:w="1772"/>
+        <w:gridCol w:w="1109"/>
+        <w:gridCol w:w="1109"/>
+        <w:gridCol w:w="1106"/>
       </w:tblGrid>
       <w:tr>
         <w:tc>
           <w:tcPr>
-            <w:tcW w:w="1000" w:type="pct"/>
+            <w:tcW w:w="248" w:type="pct"/>
+          </w:tcPr>
+          <w:p>
+            <w:pPr>
+              <w:rPr>
+                <w:b/>
+                <w:color w:val="000000"/>
+                <w:sz w:val="20"/>
+              </w:rPr>
+            </w:pPr>
+            <w:r>
+              <w:rPr>
+                <w:b/>
+                <w:color w:val="000000"/>
+                <w:sz w:val="20"/>
+              </w:rPr>
+              <w:t>N</w:t>
+            </w:r>
+          </w:p>
+        </w:tc>
+        <w:tc>
+          <w:tcPr>
+            <w:tcW w:w="1752" w:type="pct"/>
           </w:tcPr>
           <w:p>
             <w:pPr>
@@ -953,7 +1563,7 @@
         </w:tc>
         <w:tc>
           <w:tcPr>
-            <w:tcW w:w="1000" w:type="pct"/>
+            <w:tcW w:w="1043" w:type="pct"/>
           </w:tcPr>
           <w:p>
             <w:pPr>
@@ -975,7 +1585,7 @@
         </w:tc>
         <w:tc>
           <w:tcPr>
-            <w:tcW w:w="1000" w:type="pct"/>
+            <w:tcW w:w="653" w:type="pct"/>
           </w:tcPr>
           <w:p>
             <w:pPr>
@@ -997,7 +1607,7 @@
         </w:tc>
         <w:tc>
           <w:tcPr>
-            <w:tcW w:w="1000" w:type="pct"/>
+            <w:tcW w:w="653" w:type="pct"/>
           </w:tcPr>
           <w:p>
             <w:pPr>
@@ -1019,7 +1629,7 @@
         </w:tc>
         <w:tc>
           <w:tcPr>
-            <w:tcW w:w="1000" w:type="pct"/>
+            <w:tcW w:w="652" w:type="pct"/>
           </w:tcPr>
           <w:p>
             <w:pPr>
@@ -1043,29 +1653,51 @@
       <w:tr>
         <w:tc>
           <w:tcPr>
-            <w:tcW w:w="1000" w:type="pct"/>
-          </w:tcPr>
-          <w:p>
-            <w:pPr>
-              <w:rPr>
-                <w:b/>
-                <w:color w:val="000000"/>
-                <w:sz w:val="20"/>
-              </w:rPr>
-            </w:pPr>
-            <w:r>
-              <w:rPr>
-                <w:b/>
-                <w:color w:val="000000"/>
-                <w:sz w:val="20"/>
-              </w:rPr>
-              <w:t>B_1</w:t>
-            </w:r>
-          </w:p>
-        </w:tc>
-        <w:tc>
-          <w:tcPr>
-            <w:tcW w:w="1000" w:type="pct"/>
+            <w:tcW w:w="248" w:type="pct"/>
+          </w:tcPr>
+          <w:p>
+            <w:pPr>
+              <w:rPr>
+                <w:b/>
+                <w:color w:val="000000"/>
+                <w:sz w:val="20"/>
+              </w:rPr>
+            </w:pPr>
+            <w:r>
+              <w:rPr>
+                <w:b/>
+                <w:color w:val="000000"/>
+                <w:sz w:val="20"/>
+              </w:rPr>
+              <w:t>1</w:t>
+            </w:r>
+          </w:p>
+        </w:tc>
+        <w:tc>
+          <w:tcPr>
+            <w:tcW w:w="1752" w:type="pct"/>
+          </w:tcPr>
+          <w:p>
+            <w:pPr>
+              <w:rPr>
+                <w:b/>
+                <w:color w:val="000000"/>
+                <w:sz w:val="20"/>
+              </w:rPr>
+            </w:pPr>
+            <w:r>
+              <w:rPr>
+                <w:b/>
+                <w:color w:val="000000"/>
+                <w:sz w:val="20"/>
+              </w:rPr>
+              <w:t>Flour</w:t>
+            </w:r>
+          </w:p>
+        </w:tc>
+        <w:tc>
+          <w:tcPr>
+            <w:tcW w:w="1043" w:type="pct"/>
           </w:tcPr>
           <w:p>
             <w:pPr>
@@ -1087,7 +1719,7 @@
         </w:tc>
         <w:tc>
           <w:tcPr>
-            <w:tcW w:w="1000" w:type="pct"/>
+            <w:tcW w:w="653" w:type="pct"/>
           </w:tcPr>
           <w:p>
             <w:pPr>
@@ -1109,7 +1741,7 @@
         </w:tc>
         <w:tc>
           <w:tcPr>
-            <w:tcW w:w="1000" w:type="pct"/>
+            <w:tcW w:w="653" w:type="pct"/>
           </w:tcPr>
           <w:p>
             <w:pPr>
@@ -1131,7 +1763,7 @@
         </w:tc>
         <w:tc>
           <w:tcPr>
-            <w:tcW w:w="1000" w:type="pct"/>
+            <w:tcW w:w="652" w:type="pct"/>
           </w:tcPr>
           <w:p>
             <w:pPr>
@@ -1155,29 +1787,51 @@
       <w:tr>
         <w:tc>
           <w:tcPr>
-            <w:tcW w:w="1000" w:type="pct"/>
-          </w:tcPr>
-          <w:p>
-            <w:pPr>
-              <w:rPr>
-                <w:b/>
-                <w:color w:val="000000"/>
-                <w:sz w:val="20"/>
-              </w:rPr>
-            </w:pPr>
-            <w:r>
-              <w:rPr>
-                <w:b/>
-                <w:color w:val="000000"/>
-                <w:sz w:val="20"/>
-              </w:rPr>
-              <w:t>B_2</w:t>
-            </w:r>
-          </w:p>
-        </w:tc>
-        <w:tc>
-          <w:tcPr>
-            <w:tcW w:w="1000" w:type="pct"/>
+            <w:tcW w:w="248" w:type="pct"/>
+          </w:tcPr>
+          <w:p>
+            <w:pPr>
+              <w:rPr>
+                <w:b/>
+                <w:color w:val="000000"/>
+                <w:sz w:val="20"/>
+              </w:rPr>
+            </w:pPr>
+            <w:r>
+              <w:rPr>
+                <w:b/>
+                <w:color w:val="000000"/>
+                <w:sz w:val="20"/>
+              </w:rPr>
+              <w:t>2</w:t>
+            </w:r>
+          </w:p>
+        </w:tc>
+        <w:tc>
+          <w:tcPr>
+            <w:tcW w:w="1752" w:type="pct"/>
+          </w:tcPr>
+          <w:p>
+            <w:pPr>
+              <w:rPr>
+                <w:b/>
+                <w:color w:val="000000"/>
+                <w:sz w:val="20"/>
+              </w:rPr>
+            </w:pPr>
+            <w:r>
+              <w:rPr>
+                <w:b/>
+                <w:color w:val="000000"/>
+                <w:sz w:val="20"/>
+              </w:rPr>
+              <w:t>10% BSG+70ppmE</w:t>
+            </w:r>
+          </w:p>
+        </w:tc>
+        <w:tc>
+          <w:tcPr>
+            <w:tcW w:w="1043" w:type="pct"/>
           </w:tcPr>
           <w:p>
             <w:pPr>
@@ -1199,7 +1853,7 @@
         </w:tc>
         <w:tc>
           <w:tcPr>
-            <w:tcW w:w="1000" w:type="pct"/>
+            <w:tcW w:w="653" w:type="pct"/>
           </w:tcPr>
           <w:p>
             <w:pPr>
@@ -1221,7 +1875,7 @@
         </w:tc>
         <w:tc>
           <w:tcPr>
-            <w:tcW w:w="1000" w:type="pct"/>
+            <w:tcW w:w="653" w:type="pct"/>
           </w:tcPr>
           <w:p>
             <w:pPr>
@@ -1243,7 +1897,7 @@
         </w:tc>
         <w:tc>
           <w:tcPr>
-            <w:tcW w:w="1000" w:type="pct"/>
+            <w:tcW w:w="652" w:type="pct"/>
           </w:tcPr>
           <w:p>
             <w:pPr>
@@ -1267,29 +1921,51 @@
       <w:tr>
         <w:tc>
           <w:tcPr>
-            <w:tcW w:w="1000" w:type="pct"/>
-          </w:tcPr>
-          <w:p>
-            <w:pPr>
-              <w:rPr>
-                <w:b/>
-                <w:color w:val="000000"/>
-                <w:sz w:val="20"/>
-              </w:rPr>
-            </w:pPr>
-            <w:r>
-              <w:rPr>
-                <w:b/>
-                <w:color w:val="000000"/>
-                <w:sz w:val="20"/>
-              </w:rPr>
-              <w:t>B_3</w:t>
-            </w:r>
-          </w:p>
-        </w:tc>
-        <w:tc>
-          <w:tcPr>
-            <w:tcW w:w="1000" w:type="pct"/>
+            <w:tcW w:w="248" w:type="pct"/>
+          </w:tcPr>
+          <w:p>
+            <w:pPr>
+              <w:rPr>
+                <w:b/>
+                <w:color w:val="000000"/>
+                <w:sz w:val="20"/>
+              </w:rPr>
+            </w:pPr>
+            <w:r>
+              <w:rPr>
+                <w:b/>
+                <w:color w:val="000000"/>
+                <w:sz w:val="20"/>
+              </w:rPr>
+              <w:t>3</w:t>
+            </w:r>
+          </w:p>
+        </w:tc>
+        <w:tc>
+          <w:tcPr>
+            <w:tcW w:w="1752" w:type="pct"/>
+          </w:tcPr>
+          <w:p>
+            <w:pPr>
+              <w:rPr>
+                <w:b/>
+                <w:color w:val="000000"/>
+                <w:sz w:val="20"/>
+              </w:rPr>
+            </w:pPr>
+            <w:r>
+              <w:rPr>
+                <w:b/>
+                <w:color w:val="000000"/>
+                <w:sz w:val="20"/>
+              </w:rPr>
+              <w:t>20% BSG+70ppmE</w:t>
+            </w:r>
+          </w:p>
+        </w:tc>
+        <w:tc>
+          <w:tcPr>
+            <w:tcW w:w="1043" w:type="pct"/>
           </w:tcPr>
           <w:p>
             <w:pPr>
@@ -1311,7 +1987,7 @@
         </w:tc>
         <w:tc>
           <w:tcPr>
-            <w:tcW w:w="1000" w:type="pct"/>
+            <w:tcW w:w="653" w:type="pct"/>
           </w:tcPr>
           <w:p>
             <w:pPr>
@@ -1333,7 +2009,7 @@
         </w:tc>
         <w:tc>
           <w:tcPr>
-            <w:tcW w:w="1000" w:type="pct"/>
+            <w:tcW w:w="653" w:type="pct"/>
           </w:tcPr>
           <w:p>
             <w:pPr>
@@ -1355,7 +2031,7 @@
         </w:tc>
         <w:tc>
           <w:tcPr>
-            <w:tcW w:w="1000" w:type="pct"/>
+            <w:tcW w:w="652" w:type="pct"/>
           </w:tcPr>
           <w:p>
             <w:pPr>
@@ -1379,29 +2055,51 @@
       <w:tr>
         <w:tc>
           <w:tcPr>
-            <w:tcW w:w="1000" w:type="pct"/>
-          </w:tcPr>
-          <w:p>
-            <w:pPr>
-              <w:rPr>
-                <w:b/>
-                <w:color w:val="000000"/>
-                <w:sz w:val="20"/>
-              </w:rPr>
-            </w:pPr>
-            <w:r>
-              <w:rPr>
-                <w:b/>
-                <w:color w:val="000000"/>
-                <w:sz w:val="20"/>
-              </w:rPr>
-              <w:t>B_4</w:t>
-            </w:r>
-          </w:p>
-        </w:tc>
-        <w:tc>
-          <w:tcPr>
-            <w:tcW w:w="1000" w:type="pct"/>
+            <w:tcW w:w="248" w:type="pct"/>
+          </w:tcPr>
+          <w:p>
+            <w:pPr>
+              <w:rPr>
+                <w:b/>
+                <w:color w:val="000000"/>
+                <w:sz w:val="20"/>
+              </w:rPr>
+            </w:pPr>
+            <w:r>
+              <w:rPr>
+                <w:b/>
+                <w:color w:val="000000"/>
+                <w:sz w:val="20"/>
+              </w:rPr>
+              <w:t>4</w:t>
+            </w:r>
+          </w:p>
+        </w:tc>
+        <w:tc>
+          <w:tcPr>
+            <w:tcW w:w="1752" w:type="pct"/>
+          </w:tcPr>
+          <w:p>
+            <w:pPr>
+              <w:rPr>
+                <w:b/>
+                <w:color w:val="000000"/>
+                <w:sz w:val="20"/>
+              </w:rPr>
+            </w:pPr>
+            <w:r>
+              <w:rPr>
+                <w:b/>
+                <w:color w:val="000000"/>
+                <w:sz w:val="20"/>
+              </w:rPr>
+              <w:t>10% BSG_fraction+70ppmE</w:t>
+            </w:r>
+          </w:p>
+        </w:tc>
+        <w:tc>
+          <w:tcPr>
+            <w:tcW w:w="1043" w:type="pct"/>
           </w:tcPr>
           <w:p>
             <w:pPr>
@@ -1423,7 +2121,7 @@
         </w:tc>
         <w:tc>
           <w:tcPr>
-            <w:tcW w:w="1000" w:type="pct"/>
+            <w:tcW w:w="653" w:type="pct"/>
           </w:tcPr>
           <w:p>
             <w:pPr>
@@ -1445,7 +2143,7 @@
         </w:tc>
         <w:tc>
           <w:tcPr>
-            <w:tcW w:w="1000" w:type="pct"/>
+            <w:tcW w:w="653" w:type="pct"/>
           </w:tcPr>
           <w:p>
             <w:pPr>
@@ -1467,7 +2165,7 @@
         </w:tc>
         <w:tc>
           <w:tcPr>
-            <w:tcW w:w="1000" w:type="pct"/>
+            <w:tcW w:w="652" w:type="pct"/>
           </w:tcPr>
           <w:p>
             <w:pPr>
@@ -1491,29 +2189,51 @@
       <w:tr>
         <w:tc>
           <w:tcPr>
-            <w:tcW w:w="1000" w:type="pct"/>
-          </w:tcPr>
-          <w:p>
-            <w:pPr>
-              <w:rPr>
-                <w:b/>
-                <w:color w:val="000000"/>
-                <w:sz w:val="20"/>
-              </w:rPr>
-            </w:pPr>
-            <w:r>
-              <w:rPr>
-                <w:b/>
-                <w:color w:val="000000"/>
-                <w:sz w:val="20"/>
-              </w:rPr>
-              <w:t>B_5</w:t>
-            </w:r>
-          </w:p>
-        </w:tc>
-        <w:tc>
-          <w:tcPr>
-            <w:tcW w:w="1000" w:type="pct"/>
+            <w:tcW w:w="248" w:type="pct"/>
+          </w:tcPr>
+          <w:p>
+            <w:pPr>
+              <w:rPr>
+                <w:b/>
+                <w:color w:val="000000"/>
+                <w:sz w:val="20"/>
+              </w:rPr>
+            </w:pPr>
+            <w:r>
+              <w:rPr>
+                <w:b/>
+                <w:color w:val="000000"/>
+                <w:sz w:val="20"/>
+              </w:rPr>
+              <w:t>5</w:t>
+            </w:r>
+          </w:p>
+        </w:tc>
+        <w:tc>
+          <w:tcPr>
+            <w:tcW w:w="1752" w:type="pct"/>
+          </w:tcPr>
+          <w:p>
+            <w:pPr>
+              <w:rPr>
+                <w:b/>
+                <w:color w:val="000000"/>
+                <w:sz w:val="20"/>
+              </w:rPr>
+            </w:pPr>
+            <w:r>
+              <w:rPr>
+                <w:b/>
+                <w:color w:val="000000"/>
+                <w:sz w:val="20"/>
+              </w:rPr>
+              <w:t>20% BSG_fraction+70ppmE</w:t>
+            </w:r>
+          </w:p>
+        </w:tc>
+        <w:tc>
+          <w:tcPr>
+            <w:tcW w:w="1043" w:type="pct"/>
           </w:tcPr>
           <w:p>
             <w:pPr>
@@ -1535,7 +2255,7 @@
         </w:tc>
         <w:tc>
           <w:tcPr>
-            <w:tcW w:w="1000" w:type="pct"/>
+            <w:tcW w:w="653" w:type="pct"/>
           </w:tcPr>
           <w:p>
             <w:pPr>
@@ -1557,7 +2277,7 @@
         </w:tc>
         <w:tc>
           <w:tcPr>
-            <w:tcW w:w="1000" w:type="pct"/>
+            <w:tcW w:w="653" w:type="pct"/>
           </w:tcPr>
           <w:p>
             <w:pPr>
@@ -1579,7 +2299,7 @@
         </w:tc>
         <w:tc>
           <w:tcPr>
-            <w:tcW w:w="1000" w:type="pct"/>
+            <w:tcW w:w="652" w:type="pct"/>
           </w:tcPr>
           <w:p>
             <w:pPr>
@@ -1603,29 +2323,51 @@
       <w:tr>
         <w:tc>
           <w:tcPr>
-            <w:tcW w:w="1000" w:type="pct"/>
-          </w:tcPr>
-          <w:p>
-            <w:pPr>
-              <w:rPr>
-                <w:b/>
-                <w:color w:val="000000"/>
-                <w:sz w:val="20"/>
-              </w:rPr>
-            </w:pPr>
-            <w:r>
-              <w:rPr>
-                <w:b/>
-                <w:color w:val="000000"/>
-                <w:sz w:val="20"/>
-              </w:rPr>
-              <w:t>B_6</w:t>
-            </w:r>
-          </w:p>
-        </w:tc>
-        <w:tc>
-          <w:tcPr>
-            <w:tcW w:w="1000" w:type="pct"/>
+            <w:tcW w:w="248" w:type="pct"/>
+          </w:tcPr>
+          <w:p>
+            <w:pPr>
+              <w:rPr>
+                <w:b/>
+                <w:color w:val="000000"/>
+                <w:sz w:val="20"/>
+              </w:rPr>
+            </w:pPr>
+            <w:r>
+              <w:rPr>
+                <w:b/>
+                <w:color w:val="000000"/>
+                <w:sz w:val="20"/>
+              </w:rPr>
+              <w:t>6</w:t>
+            </w:r>
+          </w:p>
+        </w:tc>
+        <w:tc>
+          <w:tcPr>
+            <w:tcW w:w="1752" w:type="pct"/>
+          </w:tcPr>
+          <w:p>
+            <w:pPr>
+              <w:rPr>
+                <w:b/>
+                <w:color w:val="000000"/>
+                <w:sz w:val="20"/>
+              </w:rPr>
+            </w:pPr>
+            <w:r>
+              <w:rPr>
+                <w:b/>
+                <w:color w:val="000000"/>
+                <w:sz w:val="20"/>
+              </w:rPr>
+              <w:t>10% BSG+140ppmE</w:t>
+            </w:r>
+          </w:p>
+        </w:tc>
+        <w:tc>
+          <w:tcPr>
+            <w:tcW w:w="1043" w:type="pct"/>
           </w:tcPr>
           <w:p>
             <w:pPr>
@@ -1647,7 +2389,7 @@
         </w:tc>
         <w:tc>
           <w:tcPr>
-            <w:tcW w:w="1000" w:type="pct"/>
+            <w:tcW w:w="653" w:type="pct"/>
           </w:tcPr>
           <w:p>
             <w:pPr>
@@ -1669,7 +2411,7 @@
         </w:tc>
         <w:tc>
           <w:tcPr>
-            <w:tcW w:w="1000" w:type="pct"/>
+            <w:tcW w:w="653" w:type="pct"/>
           </w:tcPr>
           <w:p>
             <w:pPr>
@@ -1691,7 +2433,7 @@
         </w:tc>
         <w:tc>
           <w:tcPr>
-            <w:tcW w:w="1000" w:type="pct"/>
+            <w:tcW w:w="652" w:type="pct"/>
           </w:tcPr>
           <w:p>
             <w:pPr>
@@ -1715,29 +2457,59 @@
       <w:tr>
         <w:tc>
           <w:tcPr>
-            <w:tcW w:w="1000" w:type="pct"/>
-          </w:tcPr>
-          <w:p>
-            <w:pPr>
-              <w:rPr>
-                <w:b/>
-                <w:color w:val="000000"/>
-                <w:sz w:val="20"/>
-              </w:rPr>
-            </w:pPr>
-            <w:r>
-              <w:rPr>
-                <w:b/>
-                <w:color w:val="000000"/>
-                <w:sz w:val="20"/>
-              </w:rPr>
-              <w:t>B_7</w:t>
-            </w:r>
-          </w:p>
-        </w:tc>
-        <w:tc>
-          <w:tcPr>
-            <w:tcW w:w="1000" w:type="pct"/>
+            <w:tcW w:w="248" w:type="pct"/>
+          </w:tcPr>
+          <w:p>
+            <w:pPr>
+              <w:rPr>
+                <w:b/>
+                <w:color w:val="000000"/>
+                <w:sz w:val="20"/>
+              </w:rPr>
+            </w:pPr>
+            <w:r>
+              <w:rPr>
+                <w:b/>
+                <w:color w:val="000000"/>
+                <w:sz w:val="20"/>
+              </w:rPr>
+              <w:t>7</w:t>
+            </w:r>
+          </w:p>
+        </w:tc>
+        <w:tc>
+          <w:tcPr>
+            <w:tcW w:w="1752" w:type="pct"/>
+          </w:tcPr>
+          <w:p>
+            <w:pPr>
+              <w:rPr>
+                <w:b/>
+                <w:color w:val="000000"/>
+                <w:sz w:val="20"/>
+              </w:rPr>
+            </w:pPr>
+            <w:r>
+              <w:rPr>
+                <w:b/>
+                <w:color w:val="000000"/>
+                <w:sz w:val="20"/>
+              </w:rPr>
+              <w:t>2</w:t>
+            </w:r>
+            <w:r>
+              <w:rPr>
+                <w:b/>
+                <w:color w:val="000000"/>
+                <w:sz w:val="20"/>
+              </w:rPr>
+              <w:t>0% BSG+140ppmE</w:t>
+            </w:r>
+          </w:p>
+        </w:tc>
+        <w:tc>
+          <w:tcPr>
+            <w:tcW w:w="1043" w:type="pct"/>
           </w:tcPr>
           <w:p>
             <w:pPr>
@@ -1759,7 +2531,7 @@
         </w:tc>
         <w:tc>
           <w:tcPr>
-            <w:tcW w:w="1000" w:type="pct"/>
+            <w:tcW w:w="653" w:type="pct"/>
           </w:tcPr>
           <w:p>
             <w:pPr>
@@ -1781,7 +2553,7 @@
         </w:tc>
         <w:tc>
           <w:tcPr>
-            <w:tcW w:w="1000" w:type="pct"/>
+            <w:tcW w:w="653" w:type="pct"/>
           </w:tcPr>
           <w:p>
             <w:pPr>
@@ -1803,7 +2575,7 @@
         </w:tc>
         <w:tc>
           <w:tcPr>
-            <w:tcW w:w="1000" w:type="pct"/>
+            <w:tcW w:w="652" w:type="pct"/>
           </w:tcPr>
           <w:p>
             <w:pPr>
@@ -1827,29 +2599,51 @@
       <w:tr>
         <w:tc>
           <w:tcPr>
-            <w:tcW w:w="1000" w:type="pct"/>
-          </w:tcPr>
-          <w:p>
-            <w:pPr>
-              <w:rPr>
-                <w:b/>
-                <w:color w:val="000000"/>
-                <w:sz w:val="20"/>
-              </w:rPr>
-            </w:pPr>
-            <w:r>
-              <w:rPr>
-                <w:b/>
-                <w:color w:val="000000"/>
-                <w:sz w:val="20"/>
-              </w:rPr>
-              <w:t>B_8</w:t>
-            </w:r>
-          </w:p>
-        </w:tc>
-        <w:tc>
-          <w:tcPr>
-            <w:tcW w:w="1000" w:type="pct"/>
+            <w:tcW w:w="248" w:type="pct"/>
+          </w:tcPr>
+          <w:p>
+            <w:pPr>
+              <w:rPr>
+                <w:b/>
+                <w:color w:val="000000"/>
+                <w:sz w:val="20"/>
+              </w:rPr>
+            </w:pPr>
+            <w:r>
+              <w:rPr>
+                <w:b/>
+                <w:color w:val="000000"/>
+                <w:sz w:val="20"/>
+              </w:rPr>
+              <w:t>8</w:t>
+            </w:r>
+          </w:p>
+        </w:tc>
+        <w:tc>
+          <w:tcPr>
+            <w:tcW w:w="1752" w:type="pct"/>
+          </w:tcPr>
+          <w:p>
+            <w:pPr>
+              <w:rPr>
+                <w:b/>
+                <w:color w:val="000000"/>
+                <w:sz w:val="20"/>
+              </w:rPr>
+            </w:pPr>
+            <w:r>
+              <w:rPr>
+                <w:b/>
+                <w:color w:val="000000"/>
+                <w:sz w:val="20"/>
+              </w:rPr>
+              <w:t>10% BSG_fraction+140ppmE</w:t>
+            </w:r>
+          </w:p>
+        </w:tc>
+        <w:tc>
+          <w:tcPr>
+            <w:tcW w:w="1043" w:type="pct"/>
           </w:tcPr>
           <w:p>
             <w:pPr>
@@ -1871,7 +2665,7 @@
         </w:tc>
         <w:tc>
           <w:tcPr>
-            <w:tcW w:w="1000" w:type="pct"/>
+            <w:tcW w:w="653" w:type="pct"/>
           </w:tcPr>
           <w:p>
             <w:pPr>
@@ -1893,7 +2687,7 @@
         </w:tc>
         <w:tc>
           <w:tcPr>
-            <w:tcW w:w="1000" w:type="pct"/>
+            <w:tcW w:w="653" w:type="pct"/>
           </w:tcPr>
           <w:p>
             <w:pPr>
@@ -1915,7 +2709,7 @@
         </w:tc>
         <w:tc>
           <w:tcPr>
-            <w:tcW w:w="1000" w:type="pct"/>
+            <w:tcW w:w="652" w:type="pct"/>
           </w:tcPr>
           <w:p>
             <w:pPr>
@@ -1939,29 +2733,51 @@
       <w:tr>
         <w:tc>
           <w:tcPr>
-            <w:tcW w:w="1000" w:type="pct"/>
-          </w:tcPr>
-          <w:p>
-            <w:pPr>
-              <w:rPr>
-                <w:b/>
-                <w:color w:val="000000"/>
-                <w:sz w:val="20"/>
-              </w:rPr>
-            </w:pPr>
-            <w:r>
-              <w:rPr>
-                <w:b/>
-                <w:color w:val="000000"/>
-                <w:sz w:val="20"/>
-              </w:rPr>
-              <w:t>B_9</w:t>
-            </w:r>
-          </w:p>
-        </w:tc>
-        <w:tc>
-          <w:tcPr>
-            <w:tcW w:w="1000" w:type="pct"/>
+            <w:tcW w:w="248" w:type="pct"/>
+          </w:tcPr>
+          <w:p>
+            <w:pPr>
+              <w:rPr>
+                <w:b/>
+                <w:color w:val="000000"/>
+                <w:sz w:val="20"/>
+              </w:rPr>
+            </w:pPr>
+            <w:r>
+              <w:rPr>
+                <w:b/>
+                <w:color w:val="000000"/>
+                <w:sz w:val="20"/>
+              </w:rPr>
+              <w:t>9</w:t>
+            </w:r>
+          </w:p>
+        </w:tc>
+        <w:tc>
+          <w:tcPr>
+            <w:tcW w:w="1752" w:type="pct"/>
+          </w:tcPr>
+          <w:p>
+            <w:pPr>
+              <w:rPr>
+                <w:b/>
+                <w:color w:val="000000"/>
+                <w:sz w:val="20"/>
+              </w:rPr>
+            </w:pPr>
+            <w:r>
+              <w:rPr>
+                <w:b/>
+                <w:color w:val="000000"/>
+                <w:sz w:val="20"/>
+              </w:rPr>
+              <w:t>20% BSG_fraction+140ppmE</w:t>
+            </w:r>
+          </w:p>
+        </w:tc>
+        <w:tc>
+          <w:tcPr>
+            <w:tcW w:w="1043" w:type="pct"/>
           </w:tcPr>
           <w:p>
             <w:pPr>
@@ -1983,7 +2799,7 @@
         </w:tc>
         <w:tc>
           <w:tcPr>
-            <w:tcW w:w="1000" w:type="pct"/>
+            <w:tcW w:w="653" w:type="pct"/>
           </w:tcPr>
           <w:p>
             <w:pPr>
@@ -2005,7 +2821,7 @@
         </w:tc>
         <w:tc>
           <w:tcPr>
-            <w:tcW w:w="1000" w:type="pct"/>
+            <w:tcW w:w="653" w:type="pct"/>
           </w:tcPr>
           <w:p>
             <w:pPr>
@@ -2027,7 +2843,7 @@
         </w:tc>
         <w:tc>
           <w:tcPr>
-            <w:tcW w:w="1000" w:type="pct"/>
+            <w:tcW w:w="652" w:type="pct"/>
           </w:tcPr>
           <w:p>
             <w:pPr>
@@ -2090,7 +2906,66 @@
         <w:rPr>
           <w:color w:val="000000"/>
         </w:rPr>
-        <w:t>Breads were prepared on a 250 g flour basis using a straight-dough method. The basic formulation comprised 250 g flour (wheat flour with BSG substituted at the stated level), 10 g compressed yeast, 5 g salt and 2.5 g sugar, with water added according to the water absorption of each blend (Batch A) or the volumes listed in Table 2 (Batch B). The BSG (or BSG fraction) and, where applicable, the xylanase were blended with the flour before mixing. Dough was mixed, fermented/proofed and baked under standardised conditions [to confirm: mixer and mixing time; proofing temperature, relative humidity and time; baking temperature and time]. After baking, loaves were cooled to room temperature before measurement and analysis. Identical baking and fermentation conditions were used in both batches to permit direct cross-batch comparison.</w:t>
+        <w:t>Breads were prepared on a 250 g flour basis using a straight-dough method. The basic formulation comprised 250 g flour (wheat flour with BSG substituted at the stated level), 10 g compressed yeast, 5 g salt and 2.5 g sugar, with water added according to the water absorption of each blend (</w:t>
+      </w:r>
+      <w:r>
+        <w:rPr>
+          <w:color w:val="000000"/>
+        </w:rPr>
+        <w:t>Batch 1</w:t>
+      </w:r>
+      <w:r>
+        <w:rPr>
+          <w:color w:val="000000"/>
+        </w:rPr>
+        <w:t>) or the volumes listed in Table 2 (</w:t>
+      </w:r>
+      <w:r>
+        <w:rPr>
+          <w:color w:val="000000"/>
+        </w:rPr>
+        <w:t>Batch 2</w:t>
+      </w:r>
+      <w:r>
+        <w:rPr>
+          <w:color w:val="000000"/>
+        </w:rPr>
+        <w:t xml:space="preserve">). The BSG (or BSG fraction) and, where applicable, the xylanase were blended with the flour before mixing. </w:t>
+      </w:r>
+      <w:commentRangeStart w:id="5"/>
+      <w:r>
+        <w:rPr>
+          <w:color w:val="000000"/>
+        </w:rPr>
+        <w:t>Dough was mixed using a spiral mixer for 2 min at low speed (0.25 Hz) followed by 5 min at high speed (0.5 Hz), then fermented for 40 min at 32 °C [</w:t>
+      </w:r>
+      <w:r>
+        <w:rPr>
+          <w:color w:val="000000"/>
+        </w:rPr>
+        <w:t>humidity</w:t>
+      </w:r>
+      <w:r>
+        <w:rPr>
+          <w:color w:val="000000"/>
+        </w:rPr>
+        <w:t>]. Baking was carried out in two stages: 10 min at 240 °C under a humid atmosphere, followed by 25 min at 220 °C.</w:t>
+      </w:r>
+      <w:commentRangeEnd w:id="5"/>
+      <w:r>
+        <w:rPr>
+          <w:rStyle w:val="CommentReference"/>
+          <w:color w:val="000000"/>
+          <w:sz w:val="24"/>
+          <w:szCs w:val="24"/>
+        </w:rPr>
+        <w:commentReference w:id="5"/>
+      </w:r>
+      <w:r>
+        <w:rPr>
+          <w:color w:val="000000"/>
+        </w:rPr>
+        <w:t xml:space="preserve"> After baking, loaves were cooled to room temperature before measurement and analysis. Identical baking and fermentation conditions were used in both batches to permit direct cross-batch comparison.</w:t>
       </w:r>
     </w:p>
     <w:p>
@@ -2124,7 +2999,79 @@
         <w:rPr>
           <w:color w:val="000000"/>
         </w:rPr>
-        <w:t>The compositional, rheological, technological and sensory analyses applied to each batch are summarised in Table 3. Compositional analyses were performed according to AOAC standard methods. Rheological measurements (farinograph and amylograph) were carried out in Batch A only; the resulting data were reused as the rheological background for the interpretation of Batch B, for which no new rheological measurements were made. Instrumental texture profile analysis was not performed; crumb texture was characterised exclusively by digital image analysis (Section 3.6).</w:t>
+        <w:t xml:space="preserve">The compositional, rheological, technological and sensory analyses applied to each </w:t>
+      </w:r>
+      <w:r>
+        <w:rPr>
+          <w:color w:val="000000"/>
+        </w:rPr>
+        <w:t>Batch 1 a</w:t>
+      </w:r>
+      <w:r>
+        <w:rPr>
+          <w:color w:val="000000"/>
+        </w:rPr>
+        <w:t xml:space="preserve">re </w:t>
+      </w:r>
+      <w:r>
+        <w:rPr>
+          <w:color w:val="000000"/>
+        </w:rPr>
+        <w:t>summarized</w:t>
+      </w:r>
+      <w:r>
+        <w:rPr>
+          <w:color w:val="000000"/>
+        </w:rPr>
+        <w:t xml:space="preserve"> in Table 3. Compositional analyses were performed according to AOAC standard methods. Rheological measurements (farinograph and amylograph) were carried out in Batch </w:t>
+      </w:r>
+      <w:r>
+        <w:rPr>
+          <w:color w:val="000000"/>
+        </w:rPr>
+        <w:t>1</w:t>
+      </w:r>
+      <w:r>
+        <w:rPr>
+          <w:color w:val="000000"/>
+        </w:rPr>
+        <w:t xml:space="preserve"> only; the resulting data were reused as the rheological background for the interpretation of Batch </w:t>
+      </w:r>
+      <w:r>
+        <w:rPr>
+          <w:color w:val="000000"/>
+        </w:rPr>
+        <w:t>2</w:t>
+      </w:r>
+      <w:r>
+        <w:rPr>
+          <w:color w:val="000000"/>
+        </w:rPr>
+        <w:t xml:space="preserve">, for which no new rheological measurements were made. Instrumental texture profile analysis was not performed; crumb texture was </w:t>
+      </w:r>
+      <w:r>
+        <w:rPr>
+          <w:color w:val="000000"/>
+        </w:rPr>
+        <w:t>characterized</w:t>
+      </w:r>
+      <w:r>
+        <w:rPr>
+          <w:color w:val="000000"/>
+        </w:rPr>
+        <w:t xml:space="preserve"> exclusively by digital image analysis</w:t>
+      </w:r>
+      <w:r>
+        <w:rPr>
+          <w:color w:val="000000"/>
+        </w:rPr>
+        <w:t xml:space="preserve"> in Batch 2</w:t>
+      </w:r>
+      <w:r>
+        <w:rPr>
+          <w:color w:val="000000"/>
+        </w:rPr>
+        <w:t xml:space="preserve"> (Section 3.6).</w:t>
       </w:r>
     </w:p>
     <w:p>
@@ -2143,7 +3090,43 @@
           <w:color w:val="000000"/>
           <w:sz w:val="22"/>
         </w:rPr>
-        <w:t>Table 3. Analytical methods applied in Batch A and Batch B.</w:t>
+        <w:t xml:space="preserve">Table 3. Analytical methods applied in </w:t>
+      </w:r>
+      <w:r>
+        <w:rPr>
+          <w:b/>
+          <w:i/>
+          <w:color w:val="000000"/>
+          <w:sz w:val="22"/>
+        </w:rPr>
+        <w:t>Batch 1</w:t>
+      </w:r>
+      <w:r>
+        <w:rPr>
+          <w:b/>
+          <w:i/>
+          <w:color w:val="000000"/>
+          <w:sz w:val="22"/>
+        </w:rPr>
+        <w:t xml:space="preserve"> and </w:t>
+      </w:r>
+      <w:r>
+        <w:rPr>
+          <w:b/>
+          <w:i/>
+          <w:color w:val="000000"/>
+          <w:sz w:val="22"/>
+        </w:rPr>
+        <w:t>Batch 2</w:t>
+      </w:r>
+      <w:r>
+        <w:rPr>
+          <w:b/>
+          <w:i/>
+          <w:color w:val="000000"/>
+          <w:sz w:val="22"/>
+        </w:rPr>
+        <w:t>.</w:t>
       </w:r>
     </w:p>
     <w:tbl>
@@ -2153,16 +3136,17 @@
         <w:tblLook w:val="04A0" w:firstRow="1" w:lastRow="0" w:firstColumn="1" w:lastColumn="0" w:noHBand="0" w:noVBand="1"/>
       </w:tblPr>
       <w:tblGrid>
-        <w:gridCol w:w="1698"/>
-        <w:gridCol w:w="1699"/>
-        <w:gridCol w:w="1699"/>
-        <w:gridCol w:w="1699"/>
-        <w:gridCol w:w="1699"/>
+        <w:gridCol w:w="1428"/>
+        <w:gridCol w:w="1849"/>
+        <w:gridCol w:w="1283"/>
+        <w:gridCol w:w="1283"/>
+        <w:gridCol w:w="1326"/>
+        <w:gridCol w:w="1325"/>
       </w:tblGrid>
       <w:tr>
         <w:tc>
           <w:tcPr>
-            <w:tcW w:w="1000" w:type="pct"/>
+            <w:tcW w:w="841" w:type="pct"/>
           </w:tcPr>
           <w:p>
             <w:pPr>
@@ -2184,29 +3168,29 @@
         </w:tc>
         <w:tc>
           <w:tcPr>
-            <w:tcW w:w="1000" w:type="pct"/>
-          </w:tcPr>
-          <w:p>
-            <w:pPr>
-              <w:rPr>
-                <w:b/>
-                <w:color w:val="000000"/>
-                <w:sz w:val="20"/>
-              </w:rPr>
-            </w:pPr>
-            <w:r>
-              <w:rPr>
-                <w:b/>
-                <w:color w:val="000000"/>
-                <w:sz w:val="20"/>
-              </w:rPr>
-              <w:t>Method (AOAC unless noted)</w:t>
-            </w:r>
-          </w:p>
-        </w:tc>
-        <w:tc>
-          <w:tcPr>
-            <w:tcW w:w="1000" w:type="pct"/>
+            <w:tcW w:w="832" w:type="pct"/>
+          </w:tcPr>
+          <w:p>
+            <w:pPr>
+              <w:rPr>
+                <w:b/>
+                <w:color w:val="000000"/>
+                <w:sz w:val="20"/>
+              </w:rPr>
+            </w:pPr>
+            <w:r>
+              <w:rPr>
+                <w:b/>
+                <w:color w:val="000000"/>
+                <w:sz w:val="20"/>
+              </w:rPr>
+              <w:t>Method (AOAC)</w:t>
+            </w:r>
+          </w:p>
+        </w:tc>
+        <w:tc>
+          <w:tcPr>
+            <w:tcW w:w="832" w:type="pct"/>
           </w:tcPr>
           <w:p>
             <w:pPr>
@@ -2228,45 +3212,67 @@
         </w:tc>
         <w:tc>
           <w:tcPr>
-            <w:tcW w:w="1000" w:type="pct"/>
-          </w:tcPr>
-          <w:p>
-            <w:pPr>
-              <w:rPr>
-                <w:b/>
-                <w:color w:val="000000"/>
-                <w:sz w:val="20"/>
-              </w:rPr>
-            </w:pPr>
-            <w:r>
-              <w:rPr>
-                <w:b/>
-                <w:color w:val="000000"/>
-                <w:sz w:val="20"/>
-              </w:rPr>
-              <w:t>Batch A</w:t>
-            </w:r>
-          </w:p>
-        </w:tc>
-        <w:tc>
-          <w:tcPr>
-            <w:tcW w:w="1000" w:type="pct"/>
-          </w:tcPr>
-          <w:p>
-            <w:pPr>
-              <w:rPr>
-                <w:b/>
-                <w:color w:val="000000"/>
-                <w:sz w:val="20"/>
-              </w:rPr>
-            </w:pPr>
-            <w:r>
-              <w:rPr>
-                <w:b/>
-                <w:color w:val="000000"/>
-                <w:sz w:val="20"/>
-              </w:rPr>
-              <w:t>Batch B</w:t>
+            <w:tcW w:w="832" w:type="pct"/>
+          </w:tcPr>
+          <w:p>
+            <w:pPr>
+              <w:rPr>
+                <w:b/>
+                <w:color w:val="000000"/>
+                <w:sz w:val="20"/>
+              </w:rPr>
+            </w:pPr>
+            <w:r>
+              <w:rPr>
+                <w:b/>
+                <w:color w:val="000000"/>
+                <w:sz w:val="20"/>
+              </w:rPr>
+              <w:t>Raw material</w:t>
+            </w:r>
+          </w:p>
+        </w:tc>
+        <w:tc>
+          <w:tcPr>
+            <w:tcW w:w="832" w:type="pct"/>
+          </w:tcPr>
+          <w:p>
+            <w:pPr>
+              <w:rPr>
+                <w:b/>
+                <w:color w:val="000000"/>
+                <w:sz w:val="20"/>
+              </w:rPr>
+            </w:pPr>
+            <w:r>
+              <w:rPr>
+                <w:b/>
+                <w:color w:val="000000"/>
+                <w:sz w:val="20"/>
+              </w:rPr>
+              <w:t>Batch 1</w:t>
+            </w:r>
+          </w:p>
+        </w:tc>
+        <w:tc>
+          <w:tcPr>
+            <w:tcW w:w="832" w:type="pct"/>
+          </w:tcPr>
+          <w:p>
+            <w:pPr>
+              <w:rPr>
+                <w:b/>
+                <w:color w:val="000000"/>
+                <w:sz w:val="20"/>
+              </w:rPr>
+            </w:pPr>
+            <w:r>
+              <w:rPr>
+                <w:b/>
+                <w:color w:val="000000"/>
+                <w:sz w:val="20"/>
+              </w:rPr>
+              <w:t>Batch 2</w:t>
             </w:r>
           </w:p>
         </w:tc>
@@ -2274,7 +3280,7 @@
       <w:tr>
         <w:tc>
           <w:tcPr>
-            <w:tcW w:w="1000" w:type="pct"/>
+            <w:tcW w:w="841" w:type="pct"/>
           </w:tcPr>
           <w:p>
             <w:pPr>
@@ -2296,7 +3302,7 @@
         </w:tc>
         <w:tc>
           <w:tcPr>
-            <w:tcW w:w="1000" w:type="pct"/>
+            <w:tcW w:w="832" w:type="pct"/>
           </w:tcPr>
           <w:p>
             <w:pPr>
@@ -2318,7 +3324,7 @@
         </w:tc>
         <w:tc>
           <w:tcPr>
-            <w:tcW w:w="1000" w:type="pct"/>
+            <w:tcW w:w="832" w:type="pct"/>
           </w:tcPr>
           <w:p>
             <w:pPr>
@@ -2340,7 +3346,7 @@
         </w:tc>
         <w:tc>
           <w:tcPr>
-            <w:tcW w:w="1000" w:type="pct"/>
+            <w:tcW w:w="832" w:type="pct"/>
           </w:tcPr>
           <w:p>
             <w:pPr>
@@ -2362,7 +3368,29 @@
         </w:tc>
         <w:tc>
           <w:tcPr>
-            <w:tcW w:w="1000" w:type="pct"/>
+            <w:tcW w:w="832" w:type="pct"/>
+          </w:tcPr>
+          <w:p>
+            <w:pPr>
+              <w:rPr>
+                <w:b/>
+                <w:color w:val="000000"/>
+                <w:sz w:val="20"/>
+              </w:rPr>
+            </w:pPr>
+            <w:r>
+              <w:rPr>
+                <w:b/>
+                <w:color w:val="000000"/>
+                <w:sz w:val="20"/>
+              </w:rPr>
+              <w:t>Yes</w:t>
+            </w:r>
+          </w:p>
+        </w:tc>
+        <w:tc>
+          <w:tcPr>
+            <w:tcW w:w="832" w:type="pct"/>
           </w:tcPr>
           <w:p>
             <w:pPr>
@@ -2386,7 +3414,7 @@
       <w:tr>
         <w:tc>
           <w:tcPr>
-            <w:tcW w:w="1000" w:type="pct"/>
+            <w:tcW w:w="841" w:type="pct"/>
           </w:tcPr>
           <w:p>
             <w:pPr>
@@ -2408,7 +3436,7 @@
         </w:tc>
         <w:tc>
           <w:tcPr>
-            <w:tcW w:w="1000" w:type="pct"/>
+            <w:tcW w:w="832" w:type="pct"/>
           </w:tcPr>
           <w:p>
             <w:pPr>
@@ -2430,7 +3458,7 @@
         </w:tc>
         <w:tc>
           <w:tcPr>
-            <w:tcW w:w="1000" w:type="pct"/>
+            <w:tcW w:w="832" w:type="pct"/>
           </w:tcPr>
           <w:p>
             <w:pPr>
@@ -2452,7 +3480,7 @@
         </w:tc>
         <w:tc>
           <w:tcPr>
-            <w:tcW w:w="1000" w:type="pct"/>
+            <w:tcW w:w="832" w:type="pct"/>
           </w:tcPr>
           <w:p>
             <w:pPr>
@@ -2474,7 +3502,29 @@
         </w:tc>
         <w:tc>
           <w:tcPr>
-            <w:tcW w:w="1000" w:type="pct"/>
+            <w:tcW w:w="832" w:type="pct"/>
+          </w:tcPr>
+          <w:p>
+            <w:pPr>
+              <w:rPr>
+                <w:b/>
+                <w:color w:val="000000"/>
+                <w:sz w:val="20"/>
+              </w:rPr>
+            </w:pPr>
+            <w:r>
+              <w:rPr>
+                <w:b/>
+                <w:color w:val="000000"/>
+                <w:sz w:val="20"/>
+              </w:rPr>
+              <w:t>Yes</w:t>
+            </w:r>
+          </w:p>
+        </w:tc>
+        <w:tc>
+          <w:tcPr>
+            <w:tcW w:w="832" w:type="pct"/>
           </w:tcPr>
           <w:p>
             <w:pPr>
@@ -2498,7 +3548,7 @@
       <w:tr>
         <w:tc>
           <w:tcPr>
-            <w:tcW w:w="1000" w:type="pct"/>
+            <w:tcW w:w="841" w:type="pct"/>
           </w:tcPr>
           <w:p>
             <w:pPr>
@@ -2520,7 +3570,7 @@
         </w:tc>
         <w:tc>
           <w:tcPr>
-            <w:tcW w:w="1000" w:type="pct"/>
+            <w:tcW w:w="832" w:type="pct"/>
           </w:tcPr>
           <w:p>
             <w:pPr>
@@ -2542,7 +3592,7 @@
         </w:tc>
         <w:tc>
           <w:tcPr>
-            <w:tcW w:w="1000" w:type="pct"/>
+            <w:tcW w:w="832" w:type="pct"/>
           </w:tcPr>
           <w:p>
             <w:pPr>
@@ -2564,7 +3614,7 @@
         </w:tc>
         <w:tc>
           <w:tcPr>
-            <w:tcW w:w="1000" w:type="pct"/>
+            <w:tcW w:w="832" w:type="pct"/>
           </w:tcPr>
           <w:p>
             <w:pPr>
@@ -2586,7 +3636,29 @@
         </w:tc>
         <w:tc>
           <w:tcPr>
-            <w:tcW w:w="1000" w:type="pct"/>
+            <w:tcW w:w="832" w:type="pct"/>
+          </w:tcPr>
+          <w:p>
+            <w:pPr>
+              <w:rPr>
+                <w:b/>
+                <w:color w:val="000000"/>
+                <w:sz w:val="20"/>
+              </w:rPr>
+            </w:pPr>
+            <w:r>
+              <w:rPr>
+                <w:b/>
+                <w:color w:val="000000"/>
+                <w:sz w:val="20"/>
+              </w:rPr>
+              <w:t>Yes</w:t>
+            </w:r>
+          </w:p>
+        </w:tc>
+        <w:tc>
+          <w:tcPr>
+            <w:tcW w:w="832" w:type="pct"/>
           </w:tcPr>
           <w:p>
             <w:pPr>
@@ -2610,7 +3682,7 @@
       <w:tr>
         <w:tc>
           <w:tcPr>
-            <w:tcW w:w="1000" w:type="pct"/>
+            <w:tcW w:w="841" w:type="pct"/>
           </w:tcPr>
           <w:p>
             <w:pPr>
@@ -2632,7 +3704,7 @@
         </w:tc>
         <w:tc>
           <w:tcPr>
-            <w:tcW w:w="1000" w:type="pct"/>
+            <w:tcW w:w="832" w:type="pct"/>
           </w:tcPr>
           <w:p>
             <w:pPr>
@@ -2654,7 +3726,7 @@
         </w:tc>
         <w:tc>
           <w:tcPr>
-            <w:tcW w:w="1000" w:type="pct"/>
+            <w:tcW w:w="832" w:type="pct"/>
           </w:tcPr>
           <w:p>
             <w:pPr>
@@ -2676,7 +3748,7 @@
         </w:tc>
         <w:tc>
           <w:tcPr>
-            <w:tcW w:w="1000" w:type="pct"/>
+            <w:tcW w:w="832" w:type="pct"/>
           </w:tcPr>
           <w:p>
             <w:pPr>
@@ -2698,23 +3770,45 @@
         </w:tc>
         <w:tc>
           <w:tcPr>
-            <w:tcW w:w="1000" w:type="pct"/>
-          </w:tcPr>
-          <w:p>
-            <w:pPr>
-              <w:rPr>
-                <w:b/>
-                <w:color w:val="000000"/>
-                <w:sz w:val="20"/>
-              </w:rPr>
-            </w:pPr>
-            <w:r>
-              <w:rPr>
-                <w:b/>
-                <w:color w:val="000000"/>
-                <w:sz w:val="20"/>
-              </w:rPr>
-              <w:t>Raw-material only</w:t>
+            <w:tcW w:w="832" w:type="pct"/>
+          </w:tcPr>
+          <w:p>
+            <w:pPr>
+              <w:rPr>
+                <w:b/>
+                <w:color w:val="000000"/>
+                <w:sz w:val="20"/>
+              </w:rPr>
+            </w:pPr>
+            <w:r>
+              <w:rPr>
+                <w:b/>
+                <w:color w:val="000000"/>
+                <w:sz w:val="20"/>
+              </w:rPr>
+              <w:t>No</w:t>
+            </w:r>
+          </w:p>
+        </w:tc>
+        <w:tc>
+          <w:tcPr>
+            <w:tcW w:w="832" w:type="pct"/>
+          </w:tcPr>
+          <w:p>
+            <w:pPr>
+              <w:rPr>
+                <w:b/>
+                <w:color w:val="000000"/>
+                <w:sz w:val="20"/>
+              </w:rPr>
+            </w:pPr>
+            <w:r>
+              <w:rPr>
+                <w:b/>
+                <w:color w:val="000000"/>
+                <w:sz w:val="20"/>
+              </w:rPr>
+              <w:t>No</w:t>
             </w:r>
           </w:p>
         </w:tc>
@@ -2722,7 +3816,7 @@
       <w:tr>
         <w:tc>
           <w:tcPr>
-            <w:tcW w:w="1000" w:type="pct"/>
+            <w:tcW w:w="841" w:type="pct"/>
           </w:tcPr>
           <w:p>
             <w:pPr>
@@ -2744,29 +3838,49 @@
         </w:tc>
         <w:tc>
           <w:tcPr>
-            <w:tcW w:w="1000" w:type="pct"/>
-          </w:tcPr>
-          <w:p>
-            <w:pPr>
-              <w:rPr>
-                <w:b/>
-                <w:color w:val="000000"/>
-                <w:sz w:val="20"/>
-              </w:rPr>
-            </w:pPr>
-            <w:r>
-              <w:rPr>
-                <w:b/>
-                <w:color w:val="000000"/>
-                <w:sz w:val="20"/>
-              </w:rPr>
-              <w:t>AOAC 962.09 (gravimetric) [verify code]</w:t>
-            </w:r>
-          </w:p>
-        </w:tc>
-        <w:tc>
-          <w:tcPr>
-            <w:tcW w:w="1000" w:type="pct"/>
+            <w:tcW w:w="832" w:type="pct"/>
+          </w:tcPr>
+          <w:p>
+            <w:pPr>
+              <w:rPr>
+                <w:b/>
+                <w:color w:val="000000"/>
+                <w:sz w:val="20"/>
+              </w:rPr>
+            </w:pPr>
+            <w:commentRangeStart w:id="6"/>
+            <w:r>
+              <w:rPr>
+                <w:b/>
+                <w:color w:val="000000"/>
+                <w:sz w:val="20"/>
+              </w:rPr>
+              <w:t xml:space="preserve">AOAC 962.09 </w:t>
+            </w:r>
+            <w:commentRangeEnd w:id="6"/>
+            <w:r>
+              <w:rPr>
+                <w:rStyle w:val="CommentReference"/>
+                <w:b/>
+                <w:color w:val="000000"/>
+                <w:sz w:val="20"/>
+                <w:szCs w:val="24"/>
+              </w:rPr>
+              <w:commentReference w:id="6"/>
+            </w:r>
+            <w:r>
+              <w:rPr>
+                <w:b/>
+                <w:color w:val="000000"/>
+                <w:sz w:val="20"/>
+              </w:rPr>
+              <w:t xml:space="preserve">(gravimetric) </w:t>
+            </w:r>
+          </w:p>
+        </w:tc>
+        <w:tc>
+          <w:tcPr>
+            <w:tcW w:w="832" w:type="pct"/>
           </w:tcPr>
           <w:p>
             <w:pPr>
@@ -2788,7 +3902,7 @@
         </w:tc>
         <w:tc>
           <w:tcPr>
-            <w:tcW w:w="1000" w:type="pct"/>
+            <w:tcW w:w="832" w:type="pct"/>
           </w:tcPr>
           <w:p>
             <w:pPr>
@@ -2810,7 +3924,29 @@
         </w:tc>
         <w:tc>
           <w:tcPr>
-            <w:tcW w:w="1000" w:type="pct"/>
+            <w:tcW w:w="832" w:type="pct"/>
+          </w:tcPr>
+          <w:p>
+            <w:pPr>
+              <w:rPr>
+                <w:b/>
+                <w:color w:val="000000"/>
+                <w:sz w:val="20"/>
+              </w:rPr>
+            </w:pPr>
+            <w:r>
+              <w:rPr>
+                <w:b/>
+                <w:color w:val="000000"/>
+                <w:sz w:val="20"/>
+              </w:rPr>
+              <w:t>Yes</w:t>
+            </w:r>
+          </w:p>
+        </w:tc>
+        <w:tc>
+          <w:tcPr>
+            <w:tcW w:w="832" w:type="pct"/>
           </w:tcPr>
           <w:p>
             <w:pPr>
@@ -2834,7 +3970,7 @@
       <w:tr>
         <w:tc>
           <w:tcPr>
-            <w:tcW w:w="1000" w:type="pct"/>
+            <w:tcW w:w="841" w:type="pct"/>
           </w:tcPr>
           <w:p>
             <w:pPr>
@@ -2856,7 +3992,7 @@
         </w:tc>
         <w:tc>
           <w:tcPr>
-            <w:tcW w:w="1000" w:type="pct"/>
+            <w:tcW w:w="832" w:type="pct"/>
           </w:tcPr>
           <w:p>
             <w:pPr>
@@ -2878,7 +4014,7 @@
         </w:tc>
         <w:tc>
           <w:tcPr>
-            <w:tcW w:w="1000" w:type="pct"/>
+            <w:tcW w:w="832" w:type="pct"/>
           </w:tcPr>
           <w:p>
             <w:pPr>
@@ -2900,7 +4036,29 @@
         </w:tc>
         <w:tc>
           <w:tcPr>
-            <w:tcW w:w="1000" w:type="pct"/>
+            <w:tcW w:w="832" w:type="pct"/>
+          </w:tcPr>
+          <w:p>
+            <w:pPr>
+              <w:rPr>
+                <w:b/>
+                <w:color w:val="000000"/>
+                <w:sz w:val="20"/>
+              </w:rPr>
+            </w:pPr>
+            <w:r>
+              <w:rPr>
+                <w:b/>
+                <w:color w:val="000000"/>
+                <w:sz w:val="20"/>
+              </w:rPr>
+              <w:t>-</w:t>
+            </w:r>
+          </w:p>
+        </w:tc>
+        <w:tc>
+          <w:tcPr>
+            <w:tcW w:w="832" w:type="pct"/>
           </w:tcPr>
           <w:p>
             <w:pPr>
@@ -2922,23 +4080,23 @@
         </w:tc>
         <w:tc>
           <w:tcPr>
-            <w:tcW w:w="1000" w:type="pct"/>
-          </w:tcPr>
-          <w:p>
-            <w:pPr>
-              <w:rPr>
-                <w:b/>
-                <w:color w:val="000000"/>
-                <w:sz w:val="20"/>
-              </w:rPr>
-            </w:pPr>
-            <w:r>
-              <w:rPr>
-                <w:b/>
-                <w:color w:val="000000"/>
-                <w:sz w:val="20"/>
-              </w:rPr>
-              <w:t>Reused from Batch A</w:t>
+            <w:tcW w:w="832" w:type="pct"/>
+          </w:tcPr>
+          <w:p>
+            <w:pPr>
+              <w:rPr>
+                <w:b/>
+                <w:color w:val="000000"/>
+                <w:sz w:val="20"/>
+              </w:rPr>
+            </w:pPr>
+            <w:r>
+              <w:rPr>
+                <w:b/>
+                <w:color w:val="000000"/>
+                <w:sz w:val="20"/>
+              </w:rPr>
+              <w:t>No</w:t>
             </w:r>
           </w:p>
         </w:tc>
@@ -2946,51 +4104,61 @@
       <w:tr>
         <w:tc>
           <w:tcPr>
-            <w:tcW w:w="1000" w:type="pct"/>
-          </w:tcPr>
-          <w:p>
-            <w:pPr>
-              <w:rPr>
-                <w:b/>
-                <w:color w:val="000000"/>
-                <w:sz w:val="20"/>
-              </w:rPr>
-            </w:pPr>
-            <w:r>
-              <w:rPr>
-                <w:b/>
-                <w:color w:val="000000"/>
-                <w:sz w:val="20"/>
-              </w:rPr>
-              <w:t>Amylograph (gelatinisation temperature, peak viscosity)</w:t>
-            </w:r>
-          </w:p>
-        </w:tc>
-        <w:tc>
-          <w:tcPr>
-            <w:tcW w:w="1000" w:type="pct"/>
-          </w:tcPr>
-          <w:p>
-            <w:pPr>
-              <w:rPr>
-                <w:b/>
-                <w:color w:val="000000"/>
-                <w:sz w:val="20"/>
-              </w:rPr>
-            </w:pPr>
-            <w:r>
-              <w:rPr>
-                <w:b/>
-                <w:color w:val="000000"/>
-                <w:sz w:val="20"/>
-              </w:rPr>
+            <w:tcW w:w="841" w:type="pct"/>
+          </w:tcPr>
+          <w:p>
+            <w:pPr>
+              <w:rPr>
+                <w:b/>
+                <w:color w:val="000000"/>
+                <w:sz w:val="20"/>
+              </w:rPr>
+            </w:pPr>
+            <w:r>
+              <w:rPr>
+                <w:b/>
+                <w:color w:val="000000"/>
+                <w:sz w:val="20"/>
+              </w:rPr>
+              <w:t xml:space="preserve">Amylograph (gelatinisation temperature, </w:t>
+            </w:r>
+            <w:r>
+              <w:rPr>
+                <w:b/>
+                <w:color w:val="000000"/>
+                <w:sz w:val="20"/>
+              </w:rPr>
+              <w:lastRenderedPageBreak/>
+              <w:t>peak viscosity)</w:t>
+            </w:r>
+          </w:p>
+        </w:tc>
+        <w:tc>
+          <w:tcPr>
+            <w:tcW w:w="832" w:type="pct"/>
+          </w:tcPr>
+          <w:p>
+            <w:pPr>
+              <w:rPr>
+                <w:b/>
+                <w:color w:val="000000"/>
+                <w:sz w:val="20"/>
+              </w:rPr>
+            </w:pPr>
+            <w:r>
+              <w:rPr>
+                <w:b/>
+                <w:color w:val="000000"/>
+                <w:sz w:val="20"/>
+              </w:rPr>
+              <w:lastRenderedPageBreak/>
               <w:t>Amylograph</w:t>
             </w:r>
           </w:p>
         </w:tc>
         <w:tc>
           <w:tcPr>
-            <w:tcW w:w="1000" w:type="pct"/>
+            <w:tcW w:w="832" w:type="pct"/>
           </w:tcPr>
           <w:p>
             <w:pPr>
@@ -3012,7 +4180,29 @@
         </w:tc>
         <w:tc>
           <w:tcPr>
-            <w:tcW w:w="1000" w:type="pct"/>
+            <w:tcW w:w="832" w:type="pct"/>
+          </w:tcPr>
+          <w:p>
+            <w:pPr>
+              <w:rPr>
+                <w:b/>
+                <w:color w:val="000000"/>
+                <w:sz w:val="20"/>
+              </w:rPr>
+            </w:pPr>
+            <w:r>
+              <w:rPr>
+                <w:b/>
+                <w:color w:val="000000"/>
+                <w:sz w:val="20"/>
+              </w:rPr>
+              <w:t>-</w:t>
+            </w:r>
+          </w:p>
+        </w:tc>
+        <w:tc>
+          <w:tcPr>
+            <w:tcW w:w="832" w:type="pct"/>
           </w:tcPr>
           <w:p>
             <w:pPr>
@@ -3034,23 +4224,23 @@
         </w:tc>
         <w:tc>
           <w:tcPr>
-            <w:tcW w:w="1000" w:type="pct"/>
-          </w:tcPr>
-          <w:p>
-            <w:pPr>
-              <w:rPr>
-                <w:b/>
-                <w:color w:val="000000"/>
-                <w:sz w:val="20"/>
-              </w:rPr>
-            </w:pPr>
-            <w:r>
-              <w:rPr>
-                <w:b/>
-                <w:color w:val="000000"/>
-                <w:sz w:val="20"/>
-              </w:rPr>
-              <w:t>Reused from Batch A</w:t>
+            <w:tcW w:w="832" w:type="pct"/>
+          </w:tcPr>
+          <w:p>
+            <w:pPr>
+              <w:rPr>
+                <w:b/>
+                <w:color w:val="000000"/>
+                <w:sz w:val="20"/>
+              </w:rPr>
+            </w:pPr>
+            <w:r>
+              <w:rPr>
+                <w:b/>
+                <w:color w:val="000000"/>
+                <w:sz w:val="20"/>
+              </w:rPr>
+              <w:t>No</w:t>
             </w:r>
           </w:p>
         </w:tc>
@@ -3058,7 +4248,7 @@
       <w:tr>
         <w:tc>
           <w:tcPr>
-            <w:tcW w:w="1000" w:type="pct"/>
+            <w:tcW w:w="841" w:type="pct"/>
           </w:tcPr>
           <w:p>
             <w:pPr>
@@ -3080,7 +4270,7 @@
         </w:tc>
         <w:tc>
           <w:tcPr>
-            <w:tcW w:w="1000" w:type="pct"/>
+            <w:tcW w:w="832" w:type="pct"/>
           </w:tcPr>
           <w:p>
             <w:pPr>
@@ -3102,7 +4292,7 @@
         </w:tc>
         <w:tc>
           <w:tcPr>
-            <w:tcW w:w="1000" w:type="pct"/>
+            <w:tcW w:w="832" w:type="pct"/>
           </w:tcPr>
           <w:p>
             <w:pPr>
@@ -3124,7 +4314,29 @@
         </w:tc>
         <w:tc>
           <w:tcPr>
-            <w:tcW w:w="1000" w:type="pct"/>
+            <w:tcW w:w="832" w:type="pct"/>
+          </w:tcPr>
+          <w:p>
+            <w:pPr>
+              <w:rPr>
+                <w:b/>
+                <w:color w:val="000000"/>
+                <w:sz w:val="20"/>
+              </w:rPr>
+            </w:pPr>
+            <w:r>
+              <w:rPr>
+                <w:b/>
+                <w:color w:val="000000"/>
+                <w:sz w:val="20"/>
+              </w:rPr>
+              <w:t>-</w:t>
+            </w:r>
+          </w:p>
+        </w:tc>
+        <w:tc>
+          <w:tcPr>
+            <w:tcW w:w="832" w:type="pct"/>
           </w:tcPr>
           <w:p>
             <w:pPr>
@@ -3146,7 +4358,7 @@
         </w:tc>
         <w:tc>
           <w:tcPr>
-            <w:tcW w:w="1000" w:type="pct"/>
+            <w:tcW w:w="832" w:type="pct"/>
           </w:tcPr>
           <w:p>
             <w:pPr>
@@ -3170,30 +4382,29 @@
       <w:tr>
         <w:tc>
           <w:tcPr>
-            <w:tcW w:w="1000" w:type="pct"/>
-          </w:tcPr>
-          <w:p>
-            <w:pPr>
-              <w:rPr>
-                <w:b/>
-                <w:color w:val="000000"/>
-                <w:sz w:val="20"/>
-              </w:rPr>
-            </w:pPr>
-            <w:r>
-              <w:rPr>
-                <w:b/>
-                <w:color w:val="000000"/>
-                <w:sz w:val="20"/>
-              </w:rPr>
-              <w:lastRenderedPageBreak/>
+            <w:tcW w:w="841" w:type="pct"/>
+          </w:tcPr>
+          <w:p>
+            <w:pPr>
+              <w:rPr>
+                <w:b/>
+                <w:color w:val="000000"/>
+                <w:sz w:val="20"/>
+              </w:rPr>
+            </w:pPr>
+            <w:r>
+              <w:rPr>
+                <w:b/>
+                <w:color w:val="000000"/>
+                <w:sz w:val="20"/>
+              </w:rPr>
               <w:t>Height-to-width (H/W) ratio</w:t>
             </w:r>
           </w:p>
         </w:tc>
         <w:tc>
           <w:tcPr>
-            <w:tcW w:w="1000" w:type="pct"/>
+            <w:tcW w:w="832" w:type="pct"/>
           </w:tcPr>
           <w:p>
             <w:pPr>
@@ -3215,7 +4426,7 @@
         </w:tc>
         <w:tc>
           <w:tcPr>
-            <w:tcW w:w="1000" w:type="pct"/>
+            <w:tcW w:w="832" w:type="pct"/>
           </w:tcPr>
           <w:p>
             <w:pPr>
@@ -3237,7 +4448,29 @@
         </w:tc>
         <w:tc>
           <w:tcPr>
-            <w:tcW w:w="1000" w:type="pct"/>
+            <w:tcW w:w="832" w:type="pct"/>
+          </w:tcPr>
+          <w:p>
+            <w:pPr>
+              <w:rPr>
+                <w:b/>
+                <w:color w:val="000000"/>
+                <w:sz w:val="20"/>
+              </w:rPr>
+            </w:pPr>
+            <w:r>
+              <w:rPr>
+                <w:b/>
+                <w:color w:val="000000"/>
+                <w:sz w:val="20"/>
+              </w:rPr>
+              <w:t>-</w:t>
+            </w:r>
+          </w:p>
+        </w:tc>
+        <w:tc>
+          <w:tcPr>
+            <w:tcW w:w="832" w:type="pct"/>
           </w:tcPr>
           <w:p>
             <w:pPr>
@@ -3259,7 +4492,7 @@
         </w:tc>
         <w:tc>
           <w:tcPr>
-            <w:tcW w:w="1000" w:type="pct"/>
+            <w:tcW w:w="832" w:type="pct"/>
           </w:tcPr>
           <w:p>
             <w:pPr>
@@ -3283,7 +4516,7 @@
       <w:tr>
         <w:tc>
           <w:tcPr>
-            <w:tcW w:w="1000" w:type="pct"/>
+            <w:tcW w:w="841" w:type="pct"/>
           </w:tcPr>
           <w:p>
             <w:pPr>
@@ -3305,7 +4538,7 @@
         </w:tc>
         <w:tc>
           <w:tcPr>
-            <w:tcW w:w="1000" w:type="pct"/>
+            <w:tcW w:w="832" w:type="pct"/>
           </w:tcPr>
           <w:p>
             <w:pPr>
@@ -3327,7 +4560,7 @@
         </w:tc>
         <w:tc>
           <w:tcPr>
-            <w:tcW w:w="1000" w:type="pct"/>
+            <w:tcW w:w="832" w:type="pct"/>
           </w:tcPr>
           <w:p>
             <w:pPr>
@@ -3349,7 +4582,29 @@
         </w:tc>
         <w:tc>
           <w:tcPr>
-            <w:tcW w:w="1000" w:type="pct"/>
+            <w:tcW w:w="832" w:type="pct"/>
+          </w:tcPr>
+          <w:p>
+            <w:pPr>
+              <w:rPr>
+                <w:b/>
+                <w:color w:val="000000"/>
+                <w:sz w:val="20"/>
+              </w:rPr>
+            </w:pPr>
+            <w:r>
+              <w:rPr>
+                <w:b/>
+                <w:color w:val="000000"/>
+                <w:sz w:val="20"/>
+              </w:rPr>
+              <w:t>-</w:t>
+            </w:r>
+          </w:p>
+        </w:tc>
+        <w:tc>
+          <w:tcPr>
+            <w:tcW w:w="832" w:type="pct"/>
           </w:tcPr>
           <w:p>
             <w:pPr>
@@ -3371,7 +4626,7 @@
         </w:tc>
         <w:tc>
           <w:tcPr>
-            <w:tcW w:w="1000" w:type="pct"/>
+            <w:tcW w:w="832" w:type="pct"/>
           </w:tcPr>
           <w:p>
             <w:pPr>
@@ -3395,7 +4650,7 @@
       <w:tr>
         <w:tc>
           <w:tcPr>
-            <w:tcW w:w="1000" w:type="pct"/>
+            <w:tcW w:w="841" w:type="pct"/>
           </w:tcPr>
           <w:p>
             <w:pPr>
@@ -3417,7 +4672,7 @@
         </w:tc>
         <w:tc>
           <w:tcPr>
-            <w:tcW w:w="1000" w:type="pct"/>
+            <w:tcW w:w="832" w:type="pct"/>
           </w:tcPr>
           <w:p>
             <w:pPr>
@@ -3439,7 +4694,7 @@
         </w:tc>
         <w:tc>
           <w:tcPr>
-            <w:tcW w:w="1000" w:type="pct"/>
+            <w:tcW w:w="832" w:type="pct"/>
           </w:tcPr>
           <w:p>
             <w:pPr>
@@ -3461,29 +4716,51 @@
         </w:tc>
         <w:tc>
           <w:tcPr>
-            <w:tcW w:w="1000" w:type="pct"/>
-          </w:tcPr>
-          <w:p>
-            <w:pPr>
-              <w:rPr>
-                <w:b/>
-                <w:color w:val="000000"/>
-                <w:sz w:val="20"/>
-              </w:rPr>
-            </w:pPr>
-            <w:r>
-              <w:rPr>
-                <w:b/>
-                <w:color w:val="000000"/>
-                <w:sz w:val="20"/>
-              </w:rPr>
-              <w:t>Yes (retroactive, archived photos)</w:t>
-            </w:r>
-          </w:p>
-        </w:tc>
-        <w:tc>
-          <w:tcPr>
-            <w:tcW w:w="1000" w:type="pct"/>
+            <w:tcW w:w="832" w:type="pct"/>
+          </w:tcPr>
+          <w:p>
+            <w:pPr>
+              <w:rPr>
+                <w:b/>
+                <w:color w:val="000000"/>
+                <w:sz w:val="20"/>
+              </w:rPr>
+            </w:pPr>
+            <w:r>
+              <w:rPr>
+                <w:b/>
+                <w:color w:val="000000"/>
+                <w:sz w:val="20"/>
+              </w:rPr>
+              <w:t>-</w:t>
+            </w:r>
+          </w:p>
+        </w:tc>
+        <w:tc>
+          <w:tcPr>
+            <w:tcW w:w="832" w:type="pct"/>
+          </w:tcPr>
+          <w:p>
+            <w:pPr>
+              <w:rPr>
+                <w:b/>
+                <w:color w:val="000000"/>
+                <w:sz w:val="20"/>
+              </w:rPr>
+            </w:pPr>
+            <w:r>
+              <w:rPr>
+                <w:b/>
+                <w:color w:val="000000"/>
+                <w:sz w:val="20"/>
+              </w:rPr>
+              <w:t>No</w:t>
+            </w:r>
+          </w:p>
+        </w:tc>
+        <w:tc>
+          <w:tcPr>
+            <w:tcW w:w="832" w:type="pct"/>
           </w:tcPr>
           <w:p>
             <w:pPr>
@@ -3545,7 +4822,7 @@
         <w:rPr>
           <w:color w:val="000000"/>
         </w:rPr>
-        <w:t>Moisture content was determined by oven drying to constant weight (AOAC 925.10). Ash content was determined gravimetrically after incineration at 550 °C (AOAC 923.03). Crude protein was determined by the Kjeldahl method using a nitrogen-to-protein conversion factor of 6.25 (AOAC 979.09). Crude fibre was determined gravimetrically (AOAC 962.09 [verify]). Analyses were carried out on the raw materials (wheat flour, dried BSG), on the flour-BSG mixtures, and on the finished breads, as indicated in Table 3. The crude-fibre method captures predominantly insoluble cellulose and lignin and underestimates the soluble fibre released by xylanase hydrolysis, which should be borne in mind when interpreting the fibre values.</w:t>
+        <w:t>Moisture content was determined by oven drying to constant weight (AOAC 925.10). Ash content was determined gravimetrically after incineration at 550 °C (AOAC 923.03). Crude protein was determined by the Kjeldahl method using a nitrogen-to-protein conversion factor of 6.25 (AOAC 979.09). Crude fibre was determined gravimetrically (AOAC 962.09). Analyses were carried out on the raw materials (wheat flour, dried BSG), on the flour-BSG mixtures, and on the finished breads. The crude-fibre method captures predominantly insoluble cellulose and lignin and underestimates the soluble fibre released by xylanase hydrolysis, which should be borne in mind when interpreting the fibre values.</w:t>
       </w:r>
     </w:p>
     <w:p>
@@ -3599,7 +4876,25 @@
           <w:color w:val="000000"/>
           <w:sz w:val="26"/>
         </w:rPr>
-        <w:t>3.5.3 Dough rheology (Batch A)</w:t>
+        <w:t>3.5.3 Dough rheology (</w:t>
+      </w:r>
+      <w:r>
+        <w:rPr>
+          <w:rFonts w:cs="Times New Roman"/>
+          <w:b/>
+          <w:color w:val="000000"/>
+          <w:sz w:val="26"/>
+        </w:rPr>
+        <w:t>Batch 1</w:t>
+      </w:r>
+      <w:r>
+        <w:rPr>
+          <w:rFonts w:cs="Times New Roman"/>
+          <w:b/>
+          <w:color w:val="000000"/>
+          <w:sz w:val="26"/>
+        </w:rPr>
+        <w:t>)</w:t>
       </w:r>
     </w:p>
     <w:p>
@@ -3613,7 +4908,67 @@
         <w:rPr>
           <w:color w:val="000000"/>
         </w:rPr>
-        <w:t>The rheological behaviour of the doughs was characterised by farinograph and amylograph analysis. Farinograph measurements provided water absorption (at 500 FU), dough development time, stability, degree of softening and the Farinograph Quality Number (FQN); the water absorption values obtained were used to set the water addition of the corresponding Batch A breads. Amylograph measurements provided the onset and peak gelatinisation temperatures and the peak (maximum) paste viscosity. These measurements were performed in Batch A only and were reused as background for Batch B.</w:t>
+        <w:t xml:space="preserve">The rheological behaviour of the doughs was </w:t>
+      </w:r>
+      <w:r>
+        <w:rPr>
+          <w:color w:val="000000"/>
+        </w:rPr>
+        <w:t>characterized</w:t>
+      </w:r>
+      <w:r>
+        <w:rPr>
+          <w:color w:val="000000"/>
+        </w:rPr>
+        <w:t xml:space="preserve"> by farinograph and amylograph analysis. Farinograph measurements provided water absorption (at 500 FU), dough development time, stability, degree of softening and the Farinograph Quality Number (FQN); the water absorption values obtained were used to set the water addition of the corresponding </w:t>
+      </w:r>
+      <w:r>
+        <w:rPr>
+          <w:color w:val="000000"/>
+        </w:rPr>
+        <w:t>Batch 1</w:t>
+      </w:r>
+      <w:r>
+        <w:rPr>
+          <w:color w:val="000000"/>
+        </w:rPr>
+        <w:t xml:space="preserve"> breads. Amylograph measurements provided the onset and peak gelatinisation temperatures and </w:t>
+      </w:r>
+      <w:r>
+        <w:rPr>
+          <w:color w:val="000000"/>
+        </w:rPr>
+        <w:t>peak</w:t>
+      </w:r>
+      <w:r>
+        <w:rPr>
+          <w:color w:val="000000"/>
+        </w:rPr>
+        <w:t xml:space="preserve"> (maximum) paste viscosity. These measurements were performed in </w:t>
+      </w:r>
+      <w:r>
+        <w:rPr>
+          <w:color w:val="000000"/>
+        </w:rPr>
+        <w:t>Batch 1</w:t>
+      </w:r>
+      <w:r>
+        <w:rPr>
+          <w:color w:val="000000"/>
+        </w:rPr>
+        <w:t xml:space="preserve"> only and were reused as background for </w:t>
+      </w:r>
+      <w:r>
+        <w:rPr>
+          <w:color w:val="000000"/>
+        </w:rPr>
+        <w:t>Batch 2</w:t>
+      </w:r>
+      <w:r>
+        <w:rPr>
+          <w:color w:val="000000"/>
+        </w:rPr>
+        <w:t>.</w:t>
       </w:r>
     </w:p>
     <w:p>
@@ -3667,6 +5022,7 @@
           <w:color w:val="000000"/>
           <w:sz w:val="26"/>
         </w:rPr>
+        <w:lastRenderedPageBreak/>
         <w:t>3.5.5 Sensory evaluation</w:t>
       </w:r>
     </w:p>
@@ -3681,7 +5037,7 @@
         <w:rPr>
           <w:color w:val="000000"/>
         </w:rPr>
-        <w:t>Sensory analysis was carried out by a trained panel using a weighted 5-point scale expressed on a 100-point basis, evaluating bread appearance, crust surface, crumb proofing, crumb structure and elasticity, smell and taste, and an overall score. The same protocol and panel (n = 8 panellists) were used in both batches (a Phase 1 session and a Phase 2 session), so that scores are directly comparable across batches [to confirm: full attribute list and weighting]. Results are expressed as mean ± standard deviation, with the coefficient of variation used as an index of panel consensus.</w:t>
+        <w:t>Sensory analysis was carried out by a trained panel using a weighted 5-point scale expressed on a 100-point basis, evaluating bread appearance, crust surface, crumb proofing, crumb structure and elasticity, smell and taste, and an overall score. The same protocol and panel (n = 8 panellists) were used in both batches (a Phase 1 session and a Phase 2 session), so that scores are directly comparable across. Results are expressed as mean ± standard deviation, with the coefficient of variation used as an index of panel consensus.</w:t>
       </w:r>
     </w:p>
     <w:p>
@@ -3694,6 +5050,7 @@
           <w:sz w:val="28"/>
         </w:rPr>
       </w:pPr>
+      <w:commentRangeStart w:id="7"/>
       <w:r>
         <w:rPr>
           <w:rFonts w:ascii="Times New Roman" w:hAnsi="Times New Roman" w:cs="Times New Roman"/>
@@ -3715,7 +5072,19 @@
         <w:rPr>
           <w:color w:val="000000"/>
         </w:rPr>
-        <w:t>Crumb structure was quantified by digital image analysis (DIA) using an in-house pipeline named BreadScan, developed specifically for this thesis and implemented as a client-side browser application. For Batch A breads, DIA was applied retroactively to archived loaf cross-section photographs, enabling direct cross-phase comparison of crumb structure without additional baking. For Batch B, three crumb cross-sections per formulation were analysed and the results expressed as mean ± standard deviation (n = 3). The processing pipeline and parameters are described below.</w:t>
+        <w:t xml:space="preserve">Crumb structure was quantified by digital image analysis (DIA) using an in-house pipeline named BreadScan, developed specifically for this thesis and implemented as a client-side browser application. For </w:t>
+      </w:r>
+      <w:r>
+        <w:rPr>
+          <w:color w:val="000000"/>
+        </w:rPr>
+        <w:t>Batch 2</w:t>
+      </w:r>
+      <w:r>
+        <w:rPr>
+          <w:color w:val="000000"/>
+        </w:rPr>
+        <w:t>, three crumb cross-sections per formulation were analysed and the results expressed as mean ± standard deviation (n = 3). The processing pipeline and parameters are described below.</w:t>
       </w:r>
     </w:p>
     <w:p>
@@ -3817,7 +5186,14 @@
         <w:rPr>
           <w:color w:val="000000"/>
         </w:rPr>
-        <w:t>Image segmentation classified each pixel as pore or matrix using a bread-type-specific algorithm. For white/control bread, Sauvola local adaptive thresholding was applied to the CLAHE-enhanced greyscale, computing a separate threshold for each pixel from the local mean and standard deviation, T(x,y) = μ(x,y) × [1 + k × (σ(x,y)/R – 1)], with a 51 px window and k = 0.2. Local adaptive thresholding was preferred over global methods (e.g. Otsu) because a single global threshold cannot accommodate the illumination gradients of photographic crumb images (Gonzales-Barron &amp; Butler, 2006; Sauvola &amp; Pietikainen, 2000). For BSG/dark bread, a peak-mode (HisAnalysis) threshold was computed on the raw greyscale, defined as the histogram peak (the dominant crumb-matrix intensity) plus an offset; pixels darker than this threshold were classified as pores (Bosakova-Ardenska &amp; Danev, 2015).</w:t>
+        <w:t xml:space="preserve">Image segmentation classified each pixel as pore or matrix using a bread-type-specific algorithm. For white/control bread, Sauvola local adaptive thresholding was applied to the CLAHE-enhanced greyscale, computing a separate threshold for each pixel from the local mean and standard deviation, T(x,y) = μ(x,y) × [1 + k × (σ(x,y)/R – 1)], with a 51 px window and k = 0.2. Local adaptive thresholding was preferred over global methods (e.g. Otsu) because a single global threshold cannot accommodate the illumination </w:t>
+      </w:r>
+      <w:r>
+        <w:rPr>
+          <w:color w:val="000000"/>
+        </w:rPr>
+        <w:lastRenderedPageBreak/>
+        <w:t>gradients of photographic crumb images (Gonzales-Barron &amp; Butler, 2006; Sauvola &amp; Pietikainen, 2000). For BSG/dark bread, a peak-mode (HisAnalysis) threshold was computed on the raw greyscale, defined as the histogram peak (the dominant crumb-matrix intensity) plus an offset; pixels darker than this threshold were classified as pores (Bosakova-Ardenska &amp; Danev, 2015).</w:t>
       </w:r>
     </w:p>
     <w:p>
@@ -3920,6 +5296,16 @@
           <w:color w:val="000000"/>
         </w:rPr>
         <w:t>Results are reported as mean ± standard deviation. Compositional determinations were performed in duplicate (n = 2), digital-image-analysis metrics on three crumb cross-sections per formulation (n = 3), and sensory evaluation by an eight-member trained panel (n = 8). The coefficient of variation was used to express relative dispersion, particularly for the sensory data. Given the limited number of replicates and the panel size, comparisons between closely scored formulations are interpreted as indicative rather than as formally significant differences.</w:t>
+      </w:r>
+      <w:commentRangeEnd w:id="7"/>
+      <w:r>
+        <w:rPr>
+          <w:rStyle w:val="CommentReference"/>
+          <w:color w:val="000000"/>
+          <w:sz w:val="24"/>
+          <w:szCs w:val="24"/>
+        </w:rPr>
+        <w:commentReference w:id="7"/>
       </w:r>
     </w:p>
     <w:p>
@@ -3938,6 +5324,186 @@
     </w:sectPr>
   </w:body>
 </w:document>
+</file>
+
+<file path=word/comments.xml><?xml version="1.0" encoding="utf-8"?>
+<w:comments xmlns:wpc="http://schemas.microsoft.com/office/word/2010/wordprocessingCanvas" xmlns:cx="http://schemas.microsoft.com/office/drawing/2014/chartex" xmlns:cx1="http://schemas.microsoft.com/office/drawing/2015/9/8/chartex" xmlns:cx2="http://schemas.microsoft.com/office/drawing/2015/10/21/chartex" xmlns:cx3="http://schemas.microsoft.com/office/drawing/2016/5/9/chartex" xmlns:cx4="http://schemas.microsoft.com/office/drawing/2016/5/10/chartex" xmlns:cx5="http://schemas.microsoft.com/office/drawing/2016/5/11/chartex" xmlns:cx6="http://schemas.microsoft.com/office/drawing/2016/5/12/chartex" xmlns:cx7="http://schemas.microsoft.com/office/drawing/2016/5/13/chartex" xmlns:cx8="http://schemas.microsoft.com/office/drawing/2016/5/14/chartex" xmlns:mc="http://schemas.openxmlformats.org/markup-compatibility/2006" xmlns:aink="http://schemas.microsoft.com/office/drawing/2016/ink" xmlns:am3d="http://schemas.microsoft.com/office/drawing/2017/model3d" xmlns:o="urn:schemas-microsoft-com:office:office" xmlns:oel="http://schemas.microsoft.com/office/2019/extlst" xmlns:r="http://schemas.openxmlformats.org/officeDocument/2006/relationships" xmlns:m="http://schemas.openxmlformats.org/officeDocument/2006/math" xmlns:v="urn:schemas-microsoft-com:vml" xmlns:wp14="http://schemas.microsoft.com/office/word/2010/wordprocessingDrawing" xmlns:wp="http://schemas.openxmlformats.org/drawingml/2006/wordprocessingDrawing" xmlns:w10="urn:schemas-microsoft-com:office:word" xmlns:w="http://schemas.openxmlformats.org/wordprocessingml/2006/main" xmlns:w14="http://schemas.microsoft.com/office/word/2010/wordml" xmlns:w15="http://schemas.microsoft.com/office/word/2012/wordml" xmlns:w16cex="http://schemas.microsoft.com/office/word/2018/wordml/cex" xmlns:w16cid="http://schemas.microsoft.com/office/word/2016/wordml/cid" xmlns:w16="http://schemas.microsoft.com/office/word/2018/wordml" xmlns:w16du="http://schemas.microsoft.com/office/word/2023/wordml/word16du" xmlns:w16sdtdh="http://schemas.microsoft.com/office/word/2020/wordml/sdtdatahash" xmlns:w16sdtfl="http://schemas.microsoft.com/office/word/2024/wordml/sdtformatlock" xmlns:w16se="http://schemas.microsoft.com/office/word/2015/wordml/symex" xmlns:wpg="http://schemas.microsoft.com/office/word/2010/wordprocessingGroup" xmlns:wpi="http://schemas.microsoft.com/office/word/2010/wordprocessingInk" xmlns:wne="http://schemas.microsoft.com/office/word/2006/wordml" xmlns:wps="http://schemas.microsoft.com/office/word/2010/wordprocessingShape" mc:Ignorable="w14 w15 w16se w16cid w16 w16cex w16sdtdh w16sdtfl w16du wp14">
+  <w:comment w:id="0" w:author="Lucia Buzzeo" w:date="2026-06-20T08:52:00Z" w:initials="LB">
+    <w:p>
+      <w:pPr>
+        <w:pStyle w:val="CommentText"/>
+      </w:pPr>
+      <w:r>
+        <w:rPr>
+          <w:rStyle w:val="CommentReference"/>
+        </w:rPr>
+        <w:annotationRef/>
+      </w:r>
+      <w:r>
+        <w:t>Should we add something as dates here?</w:t>
+      </w:r>
+    </w:p>
+  </w:comment>
+  <w:comment w:id="1" w:author="Lucia Buzzeo" w:date="2026-06-20T08:53:00Z" w:initials="LB">
+    <w:p>
+      <w:pPr>
+        <w:pStyle w:val="CommentText"/>
+      </w:pPr>
+      <w:r>
+        <w:rPr>
+          <w:rStyle w:val="CommentReference"/>
+        </w:rPr>
+        <w:annotationRef/>
+      </w:r>
+      <w:r>
+        <w:t>Confirm</w:t>
+      </w:r>
+    </w:p>
+  </w:comment>
+  <w:comment w:id="2" w:author="Lucia Buzzeo" w:date="2026-06-20T08:53:00Z" w:initials="LB">
+    <w:p>
+      <w:pPr>
+        <w:pStyle w:val="CommentText"/>
+      </w:pPr>
+      <w:r>
+        <w:rPr>
+          <w:rStyle w:val="CommentReference"/>
+        </w:rPr>
+        <w:annotationRef/>
+      </w:r>
+      <w:r>
+        <w:t>Please share detail</w:t>
+      </w:r>
+    </w:p>
+  </w:comment>
+  <w:comment w:id="3" w:author="Lucia Buzzeo" w:date="2026-06-20T08:56:00Z" w:initials="LB">
+    <w:p>
+      <w:pPr>
+        <w:pStyle w:val="CommentText"/>
+      </w:pPr>
+      <w:r>
+        <w:rPr>
+          <w:rStyle w:val="CommentReference"/>
+        </w:rPr>
+        <w:annotationRef/>
+      </w:r>
+      <w:r>
+        <w:t>To insert bibligoraphy</w:t>
+      </w:r>
+    </w:p>
+  </w:comment>
+  <w:comment w:id="4" w:author="Lucia Buzzeo" w:date="2026-06-20T09:05:00Z" w:initials="LB">
+    <w:p>
+      <w:pPr>
+        <w:pStyle w:val="CommentText"/>
+      </w:pPr>
+      <w:r>
+        <w:rPr>
+          <w:rStyle w:val="CommentReference"/>
+        </w:rPr>
+        <w:annotationRef/>
+      </w:r>
+      <w:r>
+        <w:t>Mencionarla correctament4e</w:t>
+      </w:r>
+    </w:p>
+  </w:comment>
+  <w:comment w:id="5" w:author="Lucia Buzzeo" w:date="2026-06-20T09:36:00Z" w:initials="LB">
+    <w:p>
+      <w:pPr>
+        <w:pStyle w:val="CommentText"/>
+      </w:pPr>
+      <w:r>
+        <w:rPr>
+          <w:rStyle w:val="CommentReference"/>
+        </w:rPr>
+        <w:annotationRef/>
+      </w:r>
+      <w:r>
+        <w:t>To complete humidity and check parameters</w:t>
+      </w:r>
+    </w:p>
+  </w:comment>
+  <w:comment w:id="6" w:author="Lucia Buzzeo" w:date="2026-06-20T09:40:00Z" w:initials="LB">
+    <w:p>
+      <w:pPr>
+        <w:pStyle w:val="CommentText"/>
+      </w:pPr>
+      <w:r>
+        <w:rPr>
+          <w:rStyle w:val="CommentReference"/>
+        </w:rPr>
+        <w:annotationRef/>
+      </w:r>
+      <w:r>
+        <w:t>Verify code</w:t>
+      </w:r>
+    </w:p>
+  </w:comment>
+  <w:comment w:id="7" w:author="Lucia Buzzeo" w:date="2026-06-20T09:48:00Z" w:initials="LB">
+    <w:p>
+      <w:pPr>
+        <w:pStyle w:val="CommentText"/>
+      </w:pPr>
+      <w:r>
+        <w:rPr>
+          <w:rStyle w:val="CommentReference"/>
+        </w:rPr>
+        <w:annotationRef/>
+      </w:r>
+      <w:r>
+        <w:t>Pending to check</w:t>
+      </w:r>
+    </w:p>
+  </w:comment>
+</w:comments>
+</file>
+
+<file path=word/commentsExtended.xml><?xml version="1.0" encoding="utf-8"?>
+<w15:commentsEx xmlns:wpc="http://schemas.microsoft.com/office/word/2010/wordprocessingCanvas" xmlns:cx="http://schemas.microsoft.com/office/drawing/2014/chartex" xmlns:cx1="http://schemas.microsoft.com/office/drawing/2015/9/8/chartex" xmlns:cx2="http://schemas.microsoft.com/office/drawing/2015/10/21/chartex" xmlns:cx3="http://schemas.microsoft.com/office/drawing/2016/5/9/chartex" xmlns:cx4="http://schemas.microsoft.com/office/drawing/2016/5/10/chartex" xmlns:cx5="http://schemas.microsoft.com/office/drawing/2016/5/11/chartex" xmlns:cx6="http://schemas.microsoft.com/office/drawing/2016/5/12/chartex" xmlns:cx7="http://schemas.microsoft.com/office/drawing/2016/5/13/chartex" xmlns:cx8="http://schemas.microsoft.com/office/drawing/2016/5/14/chartex" xmlns:mc="http://schemas.openxmlformats.org/markup-compatibility/2006" xmlns:aink="http://schemas.microsoft.com/office/drawing/2016/ink" xmlns:am3d="http://schemas.microsoft.com/office/drawing/2017/model3d" xmlns:o="urn:schemas-microsoft-com:office:office" xmlns:oel="http://schemas.microsoft.com/office/2019/extlst" xmlns:r="http://schemas.openxmlformats.org/officeDocument/2006/relationships" xmlns:m="http://schemas.openxmlformats.org/officeDocument/2006/math" xmlns:v="urn:schemas-microsoft-com:vml" xmlns:wp14="http://schemas.microsoft.com/office/word/2010/wordprocessingDrawing" xmlns:wp="http://schemas.openxmlformats.org/drawingml/2006/wordprocessingDrawing" xmlns:w10="urn:schemas-microsoft-com:office:word" xmlns:w="http://schemas.openxmlformats.org/wordprocessingml/2006/main" xmlns:w14="http://schemas.microsoft.com/office/word/2010/wordml" xmlns:w15="http://schemas.microsoft.com/office/word/2012/wordml" xmlns:w16cex="http://schemas.microsoft.com/office/word/2018/wordml/cex" xmlns:w16cid="http://schemas.microsoft.com/office/word/2016/wordml/cid" xmlns:w16="http://schemas.microsoft.com/office/word/2018/wordml" xmlns:w16du="http://schemas.microsoft.com/office/word/2023/wordml/word16du" xmlns:w16sdtdh="http://schemas.microsoft.com/office/word/2020/wordml/sdtdatahash" xmlns:w16sdtfl="http://schemas.microsoft.com/office/word/2024/wordml/sdtformatlock" xmlns:w16se="http://schemas.microsoft.com/office/word/2015/wordml/symex" xmlns:wpg="http://schemas.microsoft.com/office/word/2010/wordprocessingGroup" xmlns:wpi="http://schemas.microsoft.com/office/word/2010/wordprocessingInk" xmlns:wne="http://schemas.microsoft.com/office/word/2006/wordml" xmlns:wps="http://schemas.microsoft.com/office/word/2010/wordprocessingShape" mc:Ignorable="w14 w15 w16se w16cid w16 w16cex w16sdtdh w16sdtfl w16du wp14">
+  <w15:commentEx w15:paraId="256C8C31" w15:done="0"/>
+  <w15:commentEx w15:paraId="1F1C147A" w15:done="0"/>
+  <w15:commentEx w15:paraId="65893507" w15:done="0"/>
+  <w15:commentEx w15:paraId="6A9CF7A7" w15:done="0"/>
+  <w15:commentEx w15:paraId="1B349A62" w15:done="0"/>
+  <w15:commentEx w15:paraId="7E5E24FE" w15:done="0"/>
+  <w15:commentEx w15:paraId="2F05612C" w15:done="0"/>
+  <w15:commentEx w15:paraId="233F0FD4" w15:done="0"/>
+</w15:commentsEx>
+</file>
+
+<file path=word/commentsExtensible.xml><?xml version="1.0" encoding="utf-8"?>
+<w16cex:commentsExtensible xmlns:wpc="http://schemas.microsoft.com/office/word/2010/wordprocessingCanvas" xmlns:cx="http://schemas.microsoft.com/office/drawing/2014/chartex" xmlns:cx1="http://schemas.microsoft.com/office/drawing/2015/9/8/chartex" xmlns:cx2="http://schemas.microsoft.com/office/drawing/2015/10/21/chartex" xmlns:cx3="http://schemas.microsoft.com/office/drawing/2016/5/9/chartex" xmlns:cx4="http://schemas.microsoft.com/office/drawing/2016/5/10/chartex" xmlns:cx5="http://schemas.microsoft.com/office/drawing/2016/5/11/chartex" xmlns:cx6="http://schemas.microsoft.com/office/drawing/2016/5/12/chartex" xmlns:cx7="http://schemas.microsoft.com/office/drawing/2016/5/13/chartex" xmlns:cx8="http://schemas.microsoft.com/office/drawing/2016/5/14/chartex" xmlns:cr="http://schemas.microsoft.com/office/comments/2020/reactions" xmlns:mc="http://schemas.openxmlformats.org/markup-compatibility/2006" xmlns:aink="http://schemas.microsoft.com/office/drawing/2016/ink" xmlns:am3d="http://schemas.microsoft.com/office/drawing/2017/model3d" xmlns:o="urn:schemas-microsoft-com:office:office" xmlns:oel="http://schemas.microsoft.com/office/2019/extlst" xmlns:r="http://schemas.openxmlformats.org/officeDocument/2006/relationships" xmlns:m="http://schemas.openxmlformats.org/officeDocument/2006/math" xmlns:v="urn:schemas-microsoft-com:vml" xmlns:wp14="http://schemas.microsoft.com/office/word/2010/wordprocessingDrawing" xmlns:wp="http://schemas.openxmlformats.org/drawingml/2006/wordprocessingDrawing" xmlns:w10="urn:schemas-microsoft-com:office:word" xmlns:w="http://schemas.openxmlformats.org/wordprocessingml/2006/main" xmlns:w14="http://schemas.microsoft.com/office/word/2010/wordml" xmlns:w15="http://schemas.microsoft.com/office/word/2012/wordml" xmlns:w16cex="http://schemas.microsoft.com/office/word/2018/wordml/cex" xmlns:w16cid="http://schemas.microsoft.com/office/word/2016/wordml/cid" xmlns:w16="http://schemas.microsoft.com/office/word/2018/wordml" xmlns:w16du="http://schemas.microsoft.com/office/word/2023/wordml/word16du" xmlns:w16sdtdh="http://schemas.microsoft.com/office/word/2020/wordml/sdtdatahash" xmlns:w16sdtfl="http://schemas.microsoft.com/office/word/2024/wordml/sdtformatlock" xmlns:w16se="http://schemas.microsoft.com/office/word/2015/wordml/symex" xmlns:wpg="http://schemas.microsoft.com/office/word/2010/wordprocessingGroup" xmlns:wpi="http://schemas.microsoft.com/office/word/2010/wordprocessingInk" xmlns:wne="http://schemas.microsoft.com/office/word/2006/wordml" xmlns:wps="http://schemas.microsoft.com/office/word/2010/wordprocessingShape" mc:Ignorable="w14 w15 w16se w16cid w16 w16cex w16sdtdh w16sdtfl cr w16du wp14">
+  <w16cex:commentExtensible w16cex:durableId="1AB2AC0C" w16cex:dateUtc="2026-06-20T06:52:00Z"/>
+  <w16cex:commentExtensible w16cex:durableId="158A0F14" w16cex:dateUtc="2026-06-20T06:53:00Z"/>
+  <w16cex:commentExtensible w16cex:durableId="373FB960" w16cex:dateUtc="2026-06-20T06:53:00Z"/>
+  <w16cex:commentExtensible w16cex:durableId="035BCF08" w16cex:dateUtc="2026-06-20T06:56:00Z"/>
+  <w16cex:commentExtensible w16cex:durableId="635CA30E" w16cex:dateUtc="2026-06-20T07:05:00Z"/>
+  <w16cex:commentExtensible w16cex:durableId="59396D9C" w16cex:dateUtc="2026-06-20T07:36:00Z"/>
+  <w16cex:commentExtensible w16cex:durableId="41C2612C" w16cex:dateUtc="2026-06-20T07:40:00Z"/>
+  <w16cex:commentExtensible w16cex:durableId="1DBD2613" w16cex:dateUtc="2026-06-20T07:48:00Z"/>
+</w16cex:commentsExtensible>
+</file>
+
+<file path=word/commentsIds.xml><?xml version="1.0" encoding="utf-8"?>
+<w16cid:commentsIds xmlns:wpc="http://schemas.microsoft.com/office/word/2010/wordprocessingCanvas" xmlns:cx="http://schemas.microsoft.com/office/drawing/2014/chartex" xmlns:cx1="http://schemas.microsoft.com/office/drawing/2015/9/8/chartex" xmlns:cx2="http://schemas.microsoft.com/office/drawing/2015/10/21/chartex" xmlns:cx3="http://schemas.microsoft.com/office/drawing/2016/5/9/chartex" xmlns:cx4="http://schemas.microsoft.com/office/drawing/2016/5/10/chartex" xmlns:cx5="http://schemas.microsoft.com/office/drawing/2016/5/11/chartex" xmlns:cx6="http://schemas.microsoft.com/office/drawing/2016/5/12/chartex" xmlns:cx7="http://schemas.microsoft.com/office/drawing/2016/5/13/chartex" xmlns:cx8="http://schemas.microsoft.com/office/drawing/2016/5/14/chartex" xmlns:mc="http://schemas.openxmlformats.org/markup-compatibility/2006" xmlns:aink="http://schemas.microsoft.com/office/drawing/2016/ink" xmlns:am3d="http://schemas.microsoft.com/office/drawing/2017/model3d" xmlns:o="urn:schemas-microsoft-com:office:office" xmlns:oel="http://schemas.microsoft.com/office/2019/extlst" xmlns:r="http://schemas.openxmlformats.org/officeDocument/2006/relationships" xmlns:m="http://schemas.openxmlformats.org/officeDocument/2006/math" xmlns:v="urn:schemas-microsoft-com:vml" xmlns:wp14="http://schemas.microsoft.com/office/word/2010/wordprocessingDrawing" xmlns:wp="http://schemas.openxmlformats.org/drawingml/2006/wordprocessingDrawing" xmlns:w10="urn:schemas-microsoft-com:office:word" xmlns:w="http://schemas.openxmlformats.org/wordprocessingml/2006/main" xmlns:w14="http://schemas.microsoft.com/office/word/2010/wordml" xmlns:w15="http://schemas.microsoft.com/office/word/2012/wordml" xmlns:w16cex="http://schemas.microsoft.com/office/word/2018/wordml/cex" xmlns:w16cid="http://schemas.microsoft.com/office/word/2016/wordml/cid" xmlns:w16="http://schemas.microsoft.com/office/word/2018/wordml" xmlns:w16du="http://schemas.microsoft.com/office/word/2023/wordml/word16du" xmlns:w16sdtdh="http://schemas.microsoft.com/office/word/2020/wordml/sdtdatahash" xmlns:w16sdtfl="http://schemas.microsoft.com/office/word/2024/wordml/sdtformatlock" xmlns:w16se="http://schemas.microsoft.com/office/word/2015/wordml/symex" xmlns:wpg="http://schemas.microsoft.com/office/word/2010/wordprocessingGroup" xmlns:wpi="http://schemas.microsoft.com/office/word/2010/wordprocessingInk" xmlns:wne="http://schemas.microsoft.com/office/word/2006/wordml" xmlns:wps="http://schemas.microsoft.com/office/word/2010/wordprocessingShape" mc:Ignorable="w14 w15 w16se w16cid w16 w16cex w16sdtdh w16sdtfl w16du wp14">
+  <w16cid:commentId w16cid:paraId="256C8C31" w16cid:durableId="1AB2AC0C"/>
+  <w16cid:commentId w16cid:paraId="1F1C147A" w16cid:durableId="158A0F14"/>
+  <w16cid:commentId w16cid:paraId="65893507" w16cid:durableId="373FB960"/>
+  <w16cid:commentId w16cid:paraId="6A9CF7A7" w16cid:durableId="035BCF08"/>
+  <w16cid:commentId w16cid:paraId="1B349A62" w16cid:durableId="635CA30E"/>
+  <w16cid:commentId w16cid:paraId="7E5E24FE" w16cid:durableId="59396D9C"/>
+  <w16cid:commentId w16cid:paraId="2F05612C" w16cid:durableId="41C2612C"/>
+  <w16cid:commentId w16cid:paraId="233F0FD4" w16cid:durableId="1DBD2613"/>
+</w16cid:commentsIds>
+</file>
+
+<file path=word/people.xml><?xml version="1.0" encoding="utf-8"?>
+<w15:people xmlns:wpc="http://schemas.microsoft.com/office/word/2010/wordprocessingCanvas" xmlns:cx="http://schemas.microsoft.com/office/drawing/2014/chartex" xmlns:cx1="http://schemas.microsoft.com/office/drawing/2015/9/8/chartex" xmlns:cx2="http://schemas.microsoft.com/office/drawing/2015/10/21/chartex" xmlns:cx3="http://schemas.microsoft.com/office/drawing/2016/5/9/chartex" xmlns:cx4="http://schemas.microsoft.com/office/drawing/2016/5/10/chartex" xmlns:cx5="http://schemas.microsoft.com/office/drawing/2016/5/11/chartex" xmlns:cx6="http://schemas.microsoft.com/office/drawing/2016/5/12/chartex" xmlns:cx7="http://schemas.microsoft.com/office/drawing/2016/5/13/chartex" xmlns:cx8="http://schemas.microsoft.com/office/drawing/2016/5/14/chartex" xmlns:mc="http://schemas.openxmlformats.org/markup-compatibility/2006" xmlns:aink="http://schemas.microsoft.com/office/drawing/2016/ink" xmlns:am3d="http://schemas.microsoft.com/office/drawing/2017/model3d" xmlns:o="urn:schemas-microsoft-com:office:office" xmlns:oel="http://schemas.microsoft.com/office/2019/extlst" xmlns:r="http://schemas.openxmlformats.org/officeDocument/2006/relationships" xmlns:m="http://schemas.openxmlformats.org/officeDocument/2006/math" xmlns:v="urn:schemas-microsoft-com:vml" xmlns:wp14="http://schemas.microsoft.com/office/word/2010/wordprocessingDrawing" xmlns:wp="http://schemas.openxmlformats.org/drawingml/2006/wordprocessingDrawing" xmlns:w10="urn:schemas-microsoft-com:office:word" xmlns:w="http://schemas.openxmlformats.org/wordprocessingml/2006/main" xmlns:w14="http://schemas.microsoft.com/office/word/2010/wordml" xmlns:w15="http://schemas.microsoft.com/office/word/2012/wordml" xmlns:w16cex="http://schemas.microsoft.com/office/word/2018/wordml/cex" xmlns:w16cid="http://schemas.microsoft.com/office/word/2016/wordml/cid" xmlns:w16="http://schemas.microsoft.com/office/word/2018/wordml" xmlns:w16du="http://schemas.microsoft.com/office/word/2023/wordml/word16du" xmlns:w16sdtdh="http://schemas.microsoft.com/office/word/2020/wordml/sdtdatahash" xmlns:w16sdtfl="http://schemas.microsoft.com/office/word/2024/wordml/sdtformatlock" xmlns:w16se="http://schemas.microsoft.com/office/word/2015/wordml/symex" xmlns:wpg="http://schemas.microsoft.com/office/word/2010/wordprocessingGroup" xmlns:wpi="http://schemas.microsoft.com/office/word/2010/wordprocessingInk" xmlns:wne="http://schemas.microsoft.com/office/word/2006/wordml" xmlns:wps="http://schemas.microsoft.com/office/word/2010/wordprocessingShape" mc:Ignorable="w14 w15 w16se w16cid w16 w16cex w16sdtdh w16sdtfl w16du wp14">
+  <w15:person w15:author="Lucia Buzzeo">
+    <w15:presenceInfo w15:providerId="AD" w15:userId="S::ybuzzeo@uniag.sk::b15191af-8fcd-442a-81c5-38204133d165"/>
+  </w15:person>
+</w15:people>
 </file>
 
 <file path=word/styles.xml><?xml version="1.0" encoding="utf-8"?>
@@ -4544,7 +6110,6 @@
   <w:style w:type="character" w:default="1" w:styleId="DefaultParagraphFont">
     <w:name w:val="Default Paragraph Font"/>
     <w:uiPriority w:val="1"/>
-    <w:semiHidden/>
     <w:unhideWhenUsed/>
   </w:style>
   <w:style w:type="table" w:default="1" w:styleId="TableNormal">
@@ -4875,6 +6440,74 @@
       </w:tblBorders>
     </w:tblPr>
   </w:style>
+  <w:style w:type="character" w:styleId="CommentReference">
+    <w:name w:val="annotation reference"/>
+    <w:basedOn w:val="DefaultParagraphFont"/>
+    <w:uiPriority w:val="99"/>
+    <w:semiHidden/>
+    <w:unhideWhenUsed/>
+    <w:rsid w:val="00CD5C9A"/>
+    <w:rPr>
+      <w:sz w:val="16"/>
+      <w:szCs w:val="16"/>
+    </w:rPr>
+  </w:style>
+  <w:style w:type="paragraph" w:styleId="CommentText">
+    <w:name w:val="annotation text"/>
+    <w:basedOn w:val="Normal"/>
+    <w:link w:val="CommentTextChar"/>
+    <w:uiPriority w:val="99"/>
+    <w:unhideWhenUsed/>
+    <w:rsid w:val="00CD5C9A"/>
+    <w:pPr>
+      <w:spacing w:line="240" w:lineRule="auto"/>
+    </w:pPr>
+    <w:rPr>
+      <w:sz w:val="20"/>
+      <w:szCs w:val="20"/>
+    </w:rPr>
+  </w:style>
+  <w:style w:type="character" w:customStyle="1" w:styleId="CommentTextChar">
+    <w:name w:val="Comment Text Char"/>
+    <w:basedOn w:val="DefaultParagraphFont"/>
+    <w:link w:val="CommentText"/>
+    <w:uiPriority w:val="99"/>
+    <w:rsid w:val="00CD5C9A"/>
+    <w:rPr>
+      <w:rFonts w:ascii="Times New Roman" w:hAnsi="Times New Roman" w:cs="Times New Roman"/>
+      <w:sz w:val="20"/>
+      <w:szCs w:val="20"/>
+    </w:rPr>
+  </w:style>
+  <w:style w:type="paragraph" w:styleId="CommentSubject">
+    <w:name w:val="annotation subject"/>
+    <w:basedOn w:val="CommentText"/>
+    <w:next w:val="CommentText"/>
+    <w:link w:val="CommentSubjectChar"/>
+    <w:uiPriority w:val="99"/>
+    <w:semiHidden/>
+    <w:unhideWhenUsed/>
+    <w:rsid w:val="00CD5C9A"/>
+    <w:rPr>
+      <w:b/>
+      <w:bCs/>
+    </w:rPr>
+  </w:style>
+  <w:style w:type="character" w:customStyle="1" w:styleId="CommentSubjectChar">
+    <w:name w:val="Comment Subject Char"/>
+    <w:basedOn w:val="CommentTextChar"/>
+    <w:link w:val="CommentSubject"/>
+    <w:uiPriority w:val="99"/>
+    <w:semiHidden/>
+    <w:rsid w:val="00CD5C9A"/>
+    <w:rPr>
+      <w:rFonts w:ascii="Times New Roman" w:hAnsi="Times New Roman" w:cs="Times New Roman"/>
+      <w:b/>
+      <w:bCs/>
+      <w:sz w:val="20"/>
+      <w:szCs w:val="20"/>
+    </w:rPr>
+  </w:style>
 </w:styles>
 </file>
 

</xml_diff>